<commit_message>
docs: report for practical work 1 checked against STP: page number distance, wording, headings
</commit_message>
<xml_diff>
--- a/docs/Отчет_ПЗ1.docx
+++ b/docs/Отчет_ПЗ1.docx
@@ -368,7 +368,7 @@
       <w:r>
         <w:fldChar w:fldCharType="separate"/>
       </w:r>
-      <w:hyperlink w:anchor="_Toc242561045" w:history="1">
+      <w:hyperlink w:anchor="_Toc242562266" w:history="1">
         <w:r>
           <w:rPr>
             <w:rStyle w:val="aff8"/>
@@ -395,7 +395,7 @@
             <w:noProof/>
             <w:webHidden/>
           </w:rPr>
-          <w:instrText xml:space="preserve"> PAGEREF _Toc242561045 \h </w:instrText>
+          <w:instrText xml:space="preserve"> PAGEREF _Toc242562266 \h </w:instrText>
         </w:r>
         <w:r>
           <w:rPr>
@@ -441,7 +441,7 @@
           <w14:ligatures w14:val="standardContextual"/>
         </w:rPr>
       </w:pPr>
-      <w:hyperlink w:anchor="_Toc242561046" w:history="1">
+      <w:hyperlink w:anchor="_Toc242562267" w:history="1">
         <w:r>
           <w:rPr>
             <w:rStyle w:val="aff8"/>
@@ -468,7 +468,7 @@
             <w:noProof/>
             <w:webHidden/>
           </w:rPr>
-          <w:instrText xml:space="preserve"> PAGEREF _Toc242561046 \h </w:instrText>
+          <w:instrText xml:space="preserve"> PAGEREF _Toc242562267 \h </w:instrText>
         </w:r>
         <w:r>
           <w:rPr>
@@ -514,7 +514,7 @@
           <w14:ligatures w14:val="standardContextual"/>
         </w:rPr>
       </w:pPr>
-      <w:hyperlink w:anchor="_Toc242561047" w:history="1">
+      <w:hyperlink w:anchor="_Toc242562268" w:history="1">
         <w:r>
           <w:rPr>
             <w:rStyle w:val="aff8"/>
@@ -541,7 +541,7 @@
             <w:noProof/>
             <w:webHidden/>
           </w:rPr>
-          <w:instrText xml:space="preserve"> PAGEREF _Toc242561047 \h </w:instrText>
+          <w:instrText xml:space="preserve"> PAGEREF _Toc242562268 \h </w:instrText>
         </w:r>
         <w:r>
           <w:rPr>
@@ -587,7 +587,7 @@
           <w14:ligatures w14:val="standardContextual"/>
         </w:rPr>
       </w:pPr>
-      <w:hyperlink w:anchor="_Toc242561048" w:history="1">
+      <w:hyperlink w:anchor="_Toc242562269" w:history="1">
         <w:r>
           <w:rPr>
             <w:rStyle w:val="aff8"/>
@@ -614,7 +614,7 @@
             <w:noProof/>
             <w:webHidden/>
           </w:rPr>
-          <w:instrText xml:space="preserve"> PAGEREF _Toc242561048 \h </w:instrText>
+          <w:instrText xml:space="preserve"> PAGEREF _Toc242562269 \h </w:instrText>
         </w:r>
         <w:r>
           <w:rPr>
@@ -660,7 +660,7 @@
           <w14:ligatures w14:val="standardContextual"/>
         </w:rPr>
       </w:pPr>
-      <w:hyperlink w:anchor="_Toc242561049" w:history="1">
+      <w:hyperlink w:anchor="_Toc242562270" w:history="1">
         <w:r>
           <w:rPr>
             <w:rStyle w:val="aff8"/>
@@ -687,7 +687,7 @@
             <w:noProof/>
             <w:webHidden/>
           </w:rPr>
-          <w:instrText xml:space="preserve"> PAGEREF _Toc242561049 \h </w:instrText>
+          <w:instrText xml:space="preserve"> PAGEREF _Toc242562270 \h </w:instrText>
         </w:r>
         <w:r>
           <w:rPr>
@@ -733,7 +733,7 @@
           <w14:ligatures w14:val="standardContextual"/>
         </w:rPr>
       </w:pPr>
-      <w:hyperlink w:anchor="_Toc242561050" w:history="1">
+      <w:hyperlink w:anchor="_Toc242562271" w:history="1">
         <w:r>
           <w:rPr>
             <w:rStyle w:val="aff8"/>
@@ -760,7 +760,7 @@
             <w:noProof/>
             <w:webHidden/>
           </w:rPr>
-          <w:instrText xml:space="preserve"> PAGEREF _Toc242561050 \h </w:instrText>
+          <w:instrText xml:space="preserve"> PAGEREF _Toc242562271 \h </w:instrText>
         </w:r>
         <w:r>
           <w:rPr>
@@ -806,7 +806,7 @@
           <w14:ligatures w14:val="standardContextual"/>
         </w:rPr>
       </w:pPr>
-      <w:hyperlink w:anchor="_Toc242561051" w:history="1">
+      <w:hyperlink w:anchor="_Toc242562272" w:history="1">
         <w:r>
           <w:rPr>
             <w:rStyle w:val="aff8"/>
@@ -863,7 +863,7 @@
             <w:noProof/>
             <w:webHidden/>
           </w:rPr>
-          <w:instrText xml:space="preserve"> PAGEREF _Toc242561051 \h </w:instrText>
+          <w:instrText xml:space="preserve"> PAGEREF _Toc242562272 \h </w:instrText>
         </w:r>
         <w:r>
           <w:rPr>
@@ -909,7 +909,7 @@
           <w14:ligatures w14:val="standardContextual"/>
         </w:rPr>
       </w:pPr>
-      <w:hyperlink w:anchor="_Toc242561052" w:history="1">
+      <w:hyperlink w:anchor="_Toc242562273" w:history="1">
         <w:r>
           <w:rPr>
             <w:rStyle w:val="aff8"/>
@@ -951,7 +951,7 @@
             <w:noProof/>
             <w:webHidden/>
           </w:rPr>
-          <w:instrText xml:space="preserve"> PAGEREF _Toc242561052 \h </w:instrText>
+          <w:instrText xml:space="preserve"> PAGEREF _Toc242562273 \h </w:instrText>
         </w:r>
         <w:r>
           <w:rPr>
@@ -997,7 +997,7 @@
           <w14:ligatures w14:val="standardContextual"/>
         </w:rPr>
       </w:pPr>
-      <w:hyperlink w:anchor="_Toc242561053" w:history="1">
+      <w:hyperlink w:anchor="_Toc242562274" w:history="1">
         <w:r>
           <w:rPr>
             <w:rStyle w:val="aff8"/>
@@ -1039,7 +1039,7 @@
             <w:noProof/>
             <w:webHidden/>
           </w:rPr>
-          <w:instrText xml:space="preserve"> PAGEREF _Toc242561053 \h </w:instrText>
+          <w:instrText xml:space="preserve"> PAGEREF _Toc242562274 \h </w:instrText>
         </w:r>
         <w:r>
           <w:rPr>
@@ -1085,7 +1085,7 @@
           <w14:ligatures w14:val="standardContextual"/>
         </w:rPr>
       </w:pPr>
-      <w:hyperlink w:anchor="_Toc242561054" w:history="1">
+      <w:hyperlink w:anchor="_Toc242562275" w:history="1">
         <w:r>
           <w:rPr>
             <w:rStyle w:val="aff8"/>
@@ -1127,7 +1127,7 @@
             <w:noProof/>
             <w:webHidden/>
           </w:rPr>
-          <w:instrText xml:space="preserve"> PAGEREF _Toc242561054 \h </w:instrText>
+          <w:instrText xml:space="preserve"> PAGEREF _Toc242562275 \h </w:instrText>
         </w:r>
         <w:r>
           <w:rPr>
@@ -1173,7 +1173,7 @@
           <w14:ligatures w14:val="standardContextual"/>
         </w:rPr>
       </w:pPr>
-      <w:hyperlink w:anchor="_Toc242561055" w:history="1">
+      <w:hyperlink w:anchor="_Toc242562276" w:history="1">
         <w:r>
           <w:rPr>
             <w:rStyle w:val="aff8"/>
@@ -1215,7 +1215,7 @@
             <w:noProof/>
             <w:webHidden/>
           </w:rPr>
-          <w:instrText xml:space="preserve"> PAGEREF _Toc242561055 \h </w:instrText>
+          <w:instrText xml:space="preserve"> PAGEREF _Toc242562276 \h </w:instrText>
         </w:r>
         <w:r>
           <w:rPr>
@@ -1261,7 +1261,7 @@
           <w14:ligatures w14:val="standardContextual"/>
         </w:rPr>
       </w:pPr>
-      <w:hyperlink w:anchor="_Toc242561056" w:history="1">
+      <w:hyperlink w:anchor="_Toc242562277" w:history="1">
         <w:r>
           <w:rPr>
             <w:rStyle w:val="aff8"/>
@@ -1303,7 +1303,7 @@
             <w:noProof/>
             <w:webHidden/>
           </w:rPr>
-          <w:instrText xml:space="preserve"> PAGEREF _Toc242561056 \h </w:instrText>
+          <w:instrText xml:space="preserve"> PAGEREF _Toc242562277 \h </w:instrText>
         </w:r>
         <w:r>
           <w:rPr>
@@ -1349,7 +1349,7 @@
           <w14:ligatures w14:val="standardContextual"/>
         </w:rPr>
       </w:pPr>
-      <w:hyperlink w:anchor="_Toc242561057" w:history="1">
+      <w:hyperlink w:anchor="_Toc242562278" w:history="1">
         <w:r>
           <w:rPr>
             <w:rStyle w:val="aff8"/>
@@ -1391,7 +1391,7 @@
             <w:noProof/>
             <w:webHidden/>
           </w:rPr>
-          <w:instrText xml:space="preserve"> PAGEREF _Toc242561057 \h </w:instrText>
+          <w:instrText xml:space="preserve"> PAGEREF _Toc242562278 \h </w:instrText>
         </w:r>
         <w:r>
           <w:rPr>
@@ -1437,7 +1437,7 @@
           <w14:ligatures w14:val="standardContextual"/>
         </w:rPr>
       </w:pPr>
-      <w:hyperlink w:anchor="_Toc242561058" w:history="1">
+      <w:hyperlink w:anchor="_Toc242562279" w:history="1">
         <w:r>
           <w:rPr>
             <w:rStyle w:val="aff8"/>
@@ -1479,7 +1479,7 @@
             <w:noProof/>
             <w:webHidden/>
           </w:rPr>
-          <w:instrText xml:space="preserve"> PAGEREF _Toc242561058 \h </w:instrText>
+          <w:instrText xml:space="preserve"> PAGEREF _Toc242562279 \h </w:instrText>
         </w:r>
         <w:r>
           <w:rPr>
@@ -1521,7 +1521,7 @@
         <w:pageBreakBefore/>
         <w:spacing w:before="0"/>
       </w:pPr>
-      <w:bookmarkStart w:id="0" w:name="_Toc242561045"/>
+      <w:bookmarkStart w:id="0" w:name="_Toc242562266"/>
       <w:r>
         <w:lastRenderedPageBreak/>
         <w:t>Введение</w:t>
@@ -1724,10 +1724,10 @@
         <w:pStyle w:val="1"/>
         <w:pageBreakBefore/>
         <w:spacing w:before="0"/>
-        <w:ind w:firstLine="709"/>
-        <w:jc w:val="left"/>
-      </w:pPr>
-      <w:bookmarkStart w:id="1" w:name="_Toc242561046"/>
+        <w:ind w:left="709"/>
+        <w:jc w:val="left"/>
+      </w:pPr>
+      <w:bookmarkStart w:id="1" w:name="_Toc242562267"/>
       <w:r>
         <w:lastRenderedPageBreak/>
         <w:t>1 Постановка задачи</w:t>
@@ -1763,7 +1763,7 @@
         <w:t>middleware</w:t>
       </w:r>
       <w:r>
-        <w:t xml:space="preserve"> для логирования, имитации авторизации и обработки ошибок, а также изучение шаблонизатора </w:t>
+        <w:t xml:space="preserve"> для логирования, имитации авторизации и обработки ошибок и изучение шаблонизатора </w:t>
       </w:r>
       <w:r>
         <w:rPr>
@@ -1804,7 +1804,7 @@
     </w:p>
     <w:p>
       <w:r>
-        <w:t>В рамках практического занятия необходимо решить пять задач, каждая из которых получила отражение в отдельном разделе отчета и в коде проекта:</w:t>
+        <w:t>В рамках практического занятия необходимо решить пять задач, каждая из которых получила отражение в ходе работы и в коде проекта:</w:t>
       </w:r>
     </w:p>
     <w:p>
@@ -1958,7 +1958,7 @@
     </w:p>
     <w:p>
       <w:r>
-        <w:t>Приложение должно предоставлять следующие страницы: главную со списком диаграмм, детальную страницу выбранной диаграммы, форму добавления новой диаграммы, страницу входа, журнал запросов, а также отдельные страницы ошибок 404 и 500. Форма добавления доступна только авторизованному пользователю, а введенные данные проверяются на стороне сервера. При ошибках проверки форма повторно показывается с введенными значениями и кодом 400.</w:t>
+        <w:t>Приложение должно предоставлять следующие страницы: главную со списком диаграмм, детальную страницу выбранной диаграммы, форму добавления новой диаграммы, страницу входа, журнал запросов и отдельные страницы ошибок 404 и 500. Форма добавления доступна только авторизованному пользователю, а введенные данные проверяются на стороне сервера. При ошибках проверки форма повторно показывается с введенными значениями и кодом 400.</w:t>
       </w:r>
     </w:p>
     <w:p>
@@ -1998,10 +1998,10 @@
         <w:pStyle w:val="1"/>
         <w:pageBreakBefore/>
         <w:spacing w:before="0"/>
-        <w:ind w:firstLine="709"/>
-        <w:jc w:val="left"/>
-      </w:pPr>
-      <w:bookmarkStart w:id="2" w:name="_Toc242561047"/>
+        <w:ind w:left="709"/>
+        <w:jc w:val="left"/>
+      </w:pPr>
+      <w:bookmarkStart w:id="2" w:name="_Toc242562268"/>
       <w:r>
         <w:lastRenderedPageBreak/>
         <w:t>2 Теоретическая часть</w:t>
@@ -2274,10 +2274,10 @@
         <w:pStyle w:val="1"/>
         <w:pageBreakBefore/>
         <w:spacing w:before="0"/>
-        <w:ind w:firstLine="709"/>
-        <w:jc w:val="left"/>
-      </w:pPr>
-      <w:bookmarkStart w:id="3" w:name="_Toc242561048"/>
+        <w:ind w:left="709"/>
+        <w:jc w:val="left"/>
+      </w:pPr>
+      <w:bookmarkStart w:id="3" w:name="_Toc242562269"/>
       <w:r>
         <w:lastRenderedPageBreak/>
         <w:t>3 Ход работы</w:t>
@@ -2382,7 +2382,7 @@
         <w:t>URL</w:t>
       </w:r>
       <w:r>
-        <w:t xml:space="preserve">, код состояния и время обработки в миллисекундах, а также сохраняет запись в журнал </w:t>
+        <w:t xml:space="preserve">, код состояния и время обработки в миллисекундах и сохраняет запись в журнал </w:t>
       </w:r>
       <w:r>
         <w:rPr>
@@ -2541,7 +2541,7 @@
           <w:noProof/>
         </w:rPr>
         <w:drawing>
-          <wp:inline distT="0" distB="0" distL="0" distR="0" wp14:anchorId="6087C3F6" wp14:editId="53759014">
+          <wp:inline distT="0" distB="0" distL="0" distR="0" wp14:anchorId="1134599D" wp14:editId="205E93B6">
             <wp:extent cx="3060000" cy="1835999"/>
             <wp:effectExtent l="0" t="0" r="0" b="0"/>
             <wp:docPr id="1" name="Picture 1"/>
@@ -2783,7 +2783,7 @@
           <w:noProof/>
         </w:rPr>
         <w:drawing>
-          <wp:inline distT="0" distB="0" distL="0" distR="0" wp14:anchorId="602535B1" wp14:editId="0E89ACC2">
+          <wp:inline distT="0" distB="0" distL="0" distR="0" wp14:anchorId="67557605" wp14:editId="549D93E7">
             <wp:extent cx="3060000" cy="1835999"/>
             <wp:effectExtent l="0" t="0" r="0" b="0"/>
             <wp:docPr id="2" name="Picture 2"/>
@@ -2881,7 +2881,7 @@
         <w:t>flowchart</w:t>
       </w:r>
       <w:r>
-        <w:t xml:space="preserve">, дата и время создания, а также </w:t>
+        <w:t xml:space="preserve">, дата и время создания и </w:t>
       </w:r>
       <w:r>
         <w:rPr>
@@ -2890,11 +2890,11 @@
         <w:t>DSL</w:t>
       </w:r>
       <w:r>
-        <w:t xml:space="preserve">-код в отдельном темном блоке. Ссылка «Вернуться к списку» позволяет перейти на главную страницу. Дата создания </w:t>
+        <w:t xml:space="preserve">-код в отдельном темном блоке. Ссылка «Вернуться к списку» позволяет перейти на главную страницу. Дата создания форматируется </w:t>
       </w:r>
       <w:r>
         <w:lastRenderedPageBreak/>
-        <w:t xml:space="preserve">форматируется функцией </w:t>
+        <w:t xml:space="preserve">функцией </w:t>
       </w:r>
       <w:r>
         <w:rPr>
@@ -2935,7 +2935,7 @@
           <w:noProof/>
         </w:rPr>
         <w:drawing>
-          <wp:inline distT="0" distB="0" distL="0" distR="0" wp14:anchorId="52B53FB4" wp14:editId="0E59C332">
+          <wp:inline distT="0" distB="0" distL="0" distR="0" wp14:anchorId="3C3FE8F3" wp14:editId="7AD8788F">
             <wp:extent cx="3060000" cy="1835999"/>
             <wp:effectExtent l="0" t="0" r="0" b="0"/>
             <wp:docPr id="3" name="Picture 3"/>
@@ -3056,7 +3056,7 @@
           <w:noProof/>
         </w:rPr>
         <w:drawing>
-          <wp:inline distT="0" distB="0" distL="0" distR="0" wp14:anchorId="24A210BC" wp14:editId="7868BF48">
+          <wp:inline distT="0" distB="0" distL="0" distR="0" wp14:anchorId="5D95EE53" wp14:editId="5BE4C10A">
             <wp:extent cx="3060000" cy="1835999"/>
             <wp:effectExtent l="0" t="0" r="0" b="0"/>
             <wp:docPr id="4" name="Picture 4"/>
@@ -3181,7 +3181,7 @@
           <w:noProof/>
         </w:rPr>
         <w:drawing>
-          <wp:inline distT="0" distB="0" distL="0" distR="0" wp14:anchorId="657F15D4" wp14:editId="57755CC7">
+          <wp:inline distT="0" distB="0" distL="0" distR="0" wp14:anchorId="71CE8322" wp14:editId="1A899BC7">
             <wp:extent cx="3060000" cy="1835999"/>
             <wp:effectExtent l="0" t="0" r="0" b="0"/>
             <wp:docPr id="5" name="Picture 5"/>
@@ -3284,7 +3284,7 @@
           <w:noProof/>
         </w:rPr>
         <w:drawing>
-          <wp:inline distT="0" distB="0" distL="0" distR="0" wp14:anchorId="4C75144F" wp14:editId="4299089F">
+          <wp:inline distT="0" distB="0" distL="0" distR="0" wp14:anchorId="2C29CE7A" wp14:editId="5AE2E61A">
             <wp:extent cx="3060000" cy="1835999"/>
             <wp:effectExtent l="0" t="0" r="0" b="0"/>
             <wp:docPr id="6" name="Picture 6"/>
@@ -3409,7 +3409,7 @@
           <w:noProof/>
         </w:rPr>
         <w:drawing>
-          <wp:inline distT="0" distB="0" distL="0" distR="0" wp14:anchorId="03EC8126" wp14:editId="232349ED">
+          <wp:inline distT="0" distB="0" distL="0" distR="0" wp14:anchorId="4DA24DBC" wp14:editId="668CFA6A">
             <wp:extent cx="3060000" cy="1835999"/>
             <wp:effectExtent l="0" t="0" r="0" b="0"/>
             <wp:docPr id="7" name="Picture 7"/>
@@ -3509,7 +3509,7 @@
           <w:noProof/>
         </w:rPr>
         <w:drawing>
-          <wp:inline distT="0" distB="0" distL="0" distR="0" wp14:anchorId="1BD7C8A4" wp14:editId="4038F041">
+          <wp:inline distT="0" distB="0" distL="0" distR="0" wp14:anchorId="496F9B89" wp14:editId="59AEA73E">
             <wp:extent cx="3060000" cy="1835999"/>
             <wp:effectExtent l="0" t="0" r="0" b="0"/>
             <wp:docPr id="8" name="Picture 8"/>
@@ -3616,7 +3616,7 @@
           <w:noProof/>
         </w:rPr>
         <w:drawing>
-          <wp:inline distT="0" distB="0" distL="0" distR="0" wp14:anchorId="6365BBB0" wp14:editId="50DE331E">
+          <wp:inline distT="0" distB="0" distL="0" distR="0" wp14:anchorId="1C52D283" wp14:editId="3062AF07">
             <wp:extent cx="3060000" cy="1835999"/>
             <wp:effectExtent l="0" t="0" r="0" b="0"/>
             <wp:docPr id="9" name="Picture 9"/>
@@ -3728,7 +3728,7 @@
           <w:noProof/>
         </w:rPr>
         <w:drawing>
-          <wp:inline distT="0" distB="0" distL="0" distR="0" wp14:anchorId="775BDA1D" wp14:editId="19CB9109">
+          <wp:inline distT="0" distB="0" distL="0" distR="0" wp14:anchorId="54E1654D" wp14:editId="65F818EE">
             <wp:extent cx="3060000" cy="1631999"/>
             <wp:effectExtent l="0" t="0" r="0" b="0"/>
             <wp:docPr id="10" name="Picture 10"/>
@@ -3883,7 +3883,7 @@
           <w:noProof/>
         </w:rPr>
         <w:drawing>
-          <wp:inline distT="0" distB="0" distL="0" distR="0" wp14:anchorId="3187BB8B" wp14:editId="3F32A2F5">
+          <wp:inline distT="0" distB="0" distL="0" distR="0" wp14:anchorId="79E15A1E" wp14:editId="554B342C">
             <wp:extent cx="3060000" cy="1631999"/>
             <wp:effectExtent l="0" t="0" r="0" b="0"/>
             <wp:docPr id="11" name="Picture 11"/>
@@ -3978,7 +3978,7 @@
           <w:noProof/>
         </w:rPr>
         <w:drawing>
-          <wp:inline distT="0" distB="0" distL="0" distR="0" wp14:anchorId="14A25438" wp14:editId="32859933">
+          <wp:inline distT="0" distB="0" distL="0" distR="0" wp14:anchorId="411D5ED1" wp14:editId="1ECB41CF">
             <wp:extent cx="4680000" cy="2469155"/>
             <wp:effectExtent l="0" t="0" r="0" b="0"/>
             <wp:docPr id="12" name="Picture 12"/>
@@ -4957,10 +4957,10 @@
         <w:pStyle w:val="1"/>
         <w:pageBreakBefore/>
         <w:spacing w:before="0"/>
-        <w:ind w:firstLine="709"/>
-        <w:jc w:val="left"/>
-      </w:pPr>
-      <w:bookmarkStart w:id="4" w:name="_Toc242561049"/>
+        <w:ind w:left="709"/>
+        <w:jc w:val="left"/>
+      </w:pPr>
+      <w:bookmarkStart w:id="4" w:name="_Toc242562270"/>
       <w:r>
         <w:lastRenderedPageBreak/>
         <w:t>4 Ответы на контрольные вопросы</w:t>
@@ -5322,7 +5322,7 @@
         <w:pageBreakBefore/>
         <w:spacing w:before="0"/>
       </w:pPr>
-      <w:bookmarkStart w:id="5" w:name="_Toc242561050"/>
+      <w:bookmarkStart w:id="5" w:name="_Toc242562271"/>
       <w:r>
         <w:lastRenderedPageBreak/>
         <w:t>Заключение</w:t>
@@ -5376,7 +5376,7 @@
         <w:t>URL</w:t>
       </w:r>
       <w:r>
-        <w:t xml:space="preserve">, статус и другие поля) и имитации авторизации, страницы списка, деталей и добавления элемента, а также отдельные страницы ошибок 404 и 500. Данные хранятся в массиве в памяти и используются как </w:t>
+        <w:t xml:space="preserve">, статус и другие поля) и имитации авторизации, страницы списка, деталей и добавления элемента и отдельные страницы ошибок 404 и 500. Данные хранятся в массиве в памяти и используются как </w:t>
       </w:r>
       <w:r>
         <w:rPr>
@@ -5391,16 +5391,7 @@
         <w:rPr>
           <w:i/>
         </w:rPr>
-        <w:t>REST</w:t>
-      </w:r>
-      <w:r>
-        <w:t xml:space="preserve"> </w:t>
-      </w:r>
-      <w:r>
-        <w:rPr>
-          <w:i/>
-        </w:rPr>
-        <w:t>API</w:t>
+        <w:t>REST API</w:t>
       </w:r>
       <w:r>
         <w:t>.</w:t>
@@ -5422,7 +5413,7 @@
     </w:p>
     <w:p>
       <w:r>
-        <w:t>Дополнительно реализованы проверка полей формы на стороне сервера, журнал запросов с фильтрацией по методу и типу события, а также начальные данные для тестов и демонстрации. Исходный код приложения вынесен в приложения А–И, а результаты работы показаны на рисунках 3.1–3.12.</w:t>
+        <w:t>Дополнительно реализованы проверка полей формы на стороне сервера, журнал запросов с фильтрацией по методу и типу события и начальные данные для тестов и демонстрации. Исходный код приложения вынесен в приложения А–И, а результаты работы показаны на рисунках 3.1–3.12.</w:t>
       </w:r>
     </w:p>
     <w:p>
@@ -5554,7 +5545,7 @@
         <w:pageBreakBefore/>
         <w:spacing w:before="0"/>
       </w:pPr>
-      <w:bookmarkStart w:id="6" w:name="_Toc242561051"/>
+      <w:bookmarkStart w:id="6" w:name="_Toc242562272"/>
       <w:r>
         <w:lastRenderedPageBreak/>
         <w:t>Приложение А</w:t>
@@ -6104,7 +6095,7 @@
         <w:pageBreakBefore/>
         <w:spacing w:before="0"/>
       </w:pPr>
-      <w:bookmarkStart w:id="7" w:name="_Toc242561052"/>
+      <w:bookmarkStart w:id="7" w:name="_Toc242562273"/>
       <w:r>
         <w:lastRenderedPageBreak/>
         <w:t>Приложение Б</w:t>
@@ -6530,7 +6521,7 @@
         <w:pageBreakBefore/>
         <w:spacing w:before="0"/>
       </w:pPr>
-      <w:bookmarkStart w:id="8" w:name="_Toc242561053"/>
+      <w:bookmarkStart w:id="8" w:name="_Toc242562274"/>
       <w:r>
         <w:lastRenderedPageBreak/>
         <w:t>Приложение В</w:t>
@@ -6915,7 +6906,7 @@
         <w:pageBreakBefore/>
         <w:spacing w:before="0"/>
       </w:pPr>
-      <w:bookmarkStart w:id="9" w:name="_Toc242561054"/>
+      <w:bookmarkStart w:id="9" w:name="_Toc242562275"/>
       <w:r>
         <w:lastRenderedPageBreak/>
         <w:t>Приложение Г</w:t>
@@ -7368,7 +7359,7 @@
         <w:pageBreakBefore/>
         <w:spacing w:before="0"/>
       </w:pPr>
-      <w:bookmarkStart w:id="10" w:name="_Toc242561055"/>
+      <w:bookmarkStart w:id="10" w:name="_Toc242562276"/>
       <w:r>
         <w:lastRenderedPageBreak/>
         <w:t>Приложение Д</w:t>
@@ -8056,7 +8047,7 @@
         <w:pageBreakBefore/>
         <w:spacing w:before="0"/>
       </w:pPr>
-      <w:bookmarkStart w:id="11" w:name="_Toc242561056"/>
+      <w:bookmarkStart w:id="11" w:name="_Toc242562277"/>
       <w:r>
         <w:lastRenderedPageBreak/>
         <w:t>Приложение Е</w:t>
@@ -8404,7 +8395,7 @@
         <w:pageBreakBefore/>
         <w:spacing w:before="0"/>
       </w:pPr>
-      <w:bookmarkStart w:id="12" w:name="_Toc242561057"/>
+      <w:bookmarkStart w:id="12" w:name="_Toc242562278"/>
       <w:r>
         <w:lastRenderedPageBreak/>
         <w:t>Приложение Ж</w:t>
@@ -8729,7 +8720,7 @@
         <w:pageBreakBefore/>
         <w:spacing w:before="0"/>
       </w:pPr>
-      <w:bookmarkStart w:id="13" w:name="_Toc242561058"/>
+      <w:bookmarkStart w:id="13" w:name="_Toc242562279"/>
       <w:r>
         <w:lastRenderedPageBreak/>
         <w:t>Приложение И</w:t>
@@ -9051,7 +9042,7 @@
     <w:sectPr>
       <w:footerReference w:type="default" r:id="rId20"/>
       <w:pgSz w:w="11906" w:h="16838"/>
-      <w:pgMar w:top="1134" w:right="850" w:bottom="1134" w:left="1701" w:header="720" w:footer="720" w:gutter="0"/>
+      <w:pgMar w:top="1134" w:right="850" w:bottom="1134" w:left="1701" w:header="720" w:footer="567" w:gutter="0"/>
       <w:cols w:space="720"/>
       <w:titlePg/>
       <w:docGrid w:linePitch="360"/>
@@ -9313,31 +9304,31 @@
       </w:rPr>
     </w:lvl>
   </w:abstractNum>
-  <w:num w:numId="1" w16cid:durableId="305354986">
+  <w:num w:numId="1" w16cid:durableId="2112893712">
     <w:abstractNumId w:val="8"/>
   </w:num>
-  <w:num w:numId="2" w16cid:durableId="1051075754">
+  <w:num w:numId="2" w16cid:durableId="780145086">
     <w:abstractNumId w:val="6"/>
   </w:num>
-  <w:num w:numId="3" w16cid:durableId="1144271198">
+  <w:num w:numId="3" w16cid:durableId="1358308625">
     <w:abstractNumId w:val="5"/>
   </w:num>
-  <w:num w:numId="4" w16cid:durableId="599535362">
+  <w:num w:numId="4" w16cid:durableId="507982913">
     <w:abstractNumId w:val="4"/>
   </w:num>
-  <w:num w:numId="5" w16cid:durableId="1614092944">
+  <w:num w:numId="5" w16cid:durableId="1187330495">
     <w:abstractNumId w:val="7"/>
   </w:num>
-  <w:num w:numId="6" w16cid:durableId="987828906">
+  <w:num w:numId="6" w16cid:durableId="1100683608">
     <w:abstractNumId w:val="3"/>
   </w:num>
-  <w:num w:numId="7" w16cid:durableId="827745201">
+  <w:num w:numId="7" w16cid:durableId="1544756603">
     <w:abstractNumId w:val="2"/>
   </w:num>
-  <w:num w:numId="8" w16cid:durableId="194199245">
+  <w:num w:numId="8" w16cid:durableId="1934166778">
     <w:abstractNumId w:val="1"/>
   </w:num>
-  <w:num w:numId="9" w16cid:durableId="94178638">
+  <w:num w:numId="9" w16cid:durableId="764111905">
     <w:abstractNumId w:val="0"/>
   </w:num>
 </w:numbering>
@@ -20742,7 +20733,6 @@
     <w:basedOn w:val="a1"/>
     <w:uiPriority w:val="39"/>
     <w:pPr>
-      <w:spacing w:line="240" w:lineRule="auto"/>
       <w:ind w:firstLine="0"/>
       <w:jc w:val="left"/>
     </w:pPr>
@@ -20752,7 +20742,7 @@
     <w:basedOn w:val="a2"/>
     <w:uiPriority w:val="99"/>
     <w:unhideWhenUsed/>
-    <w:rsid w:val="00E96B38"/>
+    <w:rsid w:val="00F7708A"/>
     <w:rPr>
       <w:color w:val="0000FF" w:themeColor="hyperlink"/>
       <w:u w:val="single"/>

</xml_diff>

<commit_message>
docs: report for practical work 1 after review: shorter captions, split paragraphs, conclusion wording
</commit_message>
<xml_diff>
--- a/docs/Отчет_ПЗ1.docx
+++ b/docs/Отчет_ПЗ1.docx
@@ -368,7 +368,7 @@
       <w:r>
         <w:fldChar w:fldCharType="separate"/>
       </w:r>
-      <w:hyperlink w:anchor="_Toc242562266" w:history="1">
+      <w:hyperlink w:anchor="_Toc242563654" w:history="1">
         <w:r>
           <w:rPr>
             <w:rStyle w:val="aff8"/>
@@ -395,7 +395,7 @@
             <w:noProof/>
             <w:webHidden/>
           </w:rPr>
-          <w:instrText xml:space="preserve"> PAGEREF _Toc242562266 \h </w:instrText>
+          <w:instrText xml:space="preserve"> PAGEREF _Toc242563654 \h </w:instrText>
         </w:r>
         <w:r>
           <w:rPr>
@@ -441,7 +441,7 @@
           <w14:ligatures w14:val="standardContextual"/>
         </w:rPr>
       </w:pPr>
-      <w:hyperlink w:anchor="_Toc242562267" w:history="1">
+      <w:hyperlink w:anchor="_Toc242563655" w:history="1">
         <w:r>
           <w:rPr>
             <w:rStyle w:val="aff8"/>
@@ -468,7 +468,7 @@
             <w:noProof/>
             <w:webHidden/>
           </w:rPr>
-          <w:instrText xml:space="preserve"> PAGEREF _Toc242562267 \h </w:instrText>
+          <w:instrText xml:space="preserve"> PAGEREF _Toc242563655 \h </w:instrText>
         </w:r>
         <w:r>
           <w:rPr>
@@ -514,7 +514,7 @@
           <w14:ligatures w14:val="standardContextual"/>
         </w:rPr>
       </w:pPr>
-      <w:hyperlink w:anchor="_Toc242562268" w:history="1">
+      <w:hyperlink w:anchor="_Toc242563656" w:history="1">
         <w:r>
           <w:rPr>
             <w:rStyle w:val="aff8"/>
@@ -541,7 +541,7 @@
             <w:noProof/>
             <w:webHidden/>
           </w:rPr>
-          <w:instrText xml:space="preserve"> PAGEREF _Toc242562268 \h </w:instrText>
+          <w:instrText xml:space="preserve"> PAGEREF _Toc242563656 \h </w:instrText>
         </w:r>
         <w:r>
           <w:rPr>
@@ -587,7 +587,7 @@
           <w14:ligatures w14:val="standardContextual"/>
         </w:rPr>
       </w:pPr>
-      <w:hyperlink w:anchor="_Toc242562269" w:history="1">
+      <w:hyperlink w:anchor="_Toc242563657" w:history="1">
         <w:r>
           <w:rPr>
             <w:rStyle w:val="aff8"/>
@@ -614,7 +614,7 @@
             <w:noProof/>
             <w:webHidden/>
           </w:rPr>
-          <w:instrText xml:space="preserve"> PAGEREF _Toc242562269 \h </w:instrText>
+          <w:instrText xml:space="preserve"> PAGEREF _Toc242563657 \h </w:instrText>
         </w:r>
         <w:r>
           <w:rPr>
@@ -660,7 +660,7 @@
           <w14:ligatures w14:val="standardContextual"/>
         </w:rPr>
       </w:pPr>
-      <w:hyperlink w:anchor="_Toc242562270" w:history="1">
+      <w:hyperlink w:anchor="_Toc242563658" w:history="1">
         <w:r>
           <w:rPr>
             <w:rStyle w:val="aff8"/>
@@ -687,7 +687,7 @@
             <w:noProof/>
             <w:webHidden/>
           </w:rPr>
-          <w:instrText xml:space="preserve"> PAGEREF _Toc242562270 \h </w:instrText>
+          <w:instrText xml:space="preserve"> PAGEREF _Toc242563658 \h </w:instrText>
         </w:r>
         <w:r>
           <w:rPr>
@@ -733,7 +733,7 @@
           <w14:ligatures w14:val="standardContextual"/>
         </w:rPr>
       </w:pPr>
-      <w:hyperlink w:anchor="_Toc242562271" w:history="1">
+      <w:hyperlink w:anchor="_Toc242563659" w:history="1">
         <w:r>
           <w:rPr>
             <w:rStyle w:val="aff8"/>
@@ -760,7 +760,7 @@
             <w:noProof/>
             <w:webHidden/>
           </w:rPr>
-          <w:instrText xml:space="preserve"> PAGEREF _Toc242562271 \h </w:instrText>
+          <w:instrText xml:space="preserve"> PAGEREF _Toc242563659 \h </w:instrText>
         </w:r>
         <w:r>
           <w:rPr>
@@ -806,7 +806,7 @@
           <w14:ligatures w14:val="standardContextual"/>
         </w:rPr>
       </w:pPr>
-      <w:hyperlink w:anchor="_Toc242562272" w:history="1">
+      <w:hyperlink w:anchor="_Toc242563660" w:history="1">
         <w:r>
           <w:rPr>
             <w:rStyle w:val="aff8"/>
@@ -863,7 +863,7 @@
             <w:noProof/>
             <w:webHidden/>
           </w:rPr>
-          <w:instrText xml:space="preserve"> PAGEREF _Toc242562272 \h </w:instrText>
+          <w:instrText xml:space="preserve"> PAGEREF _Toc242563660 \h </w:instrText>
         </w:r>
         <w:r>
           <w:rPr>
@@ -909,7 +909,7 @@
           <w14:ligatures w14:val="standardContextual"/>
         </w:rPr>
       </w:pPr>
-      <w:hyperlink w:anchor="_Toc242562273" w:history="1">
+      <w:hyperlink w:anchor="_Toc242563661" w:history="1">
         <w:r>
           <w:rPr>
             <w:rStyle w:val="aff8"/>
@@ -951,7 +951,7 @@
             <w:noProof/>
             <w:webHidden/>
           </w:rPr>
-          <w:instrText xml:space="preserve"> PAGEREF _Toc242562273 \h </w:instrText>
+          <w:instrText xml:space="preserve"> PAGEREF _Toc242563661 \h </w:instrText>
         </w:r>
         <w:r>
           <w:rPr>
@@ -997,7 +997,7 @@
           <w14:ligatures w14:val="standardContextual"/>
         </w:rPr>
       </w:pPr>
-      <w:hyperlink w:anchor="_Toc242562274" w:history="1">
+      <w:hyperlink w:anchor="_Toc242563662" w:history="1">
         <w:r>
           <w:rPr>
             <w:rStyle w:val="aff8"/>
@@ -1039,7 +1039,7 @@
             <w:noProof/>
             <w:webHidden/>
           </w:rPr>
-          <w:instrText xml:space="preserve"> PAGEREF _Toc242562274 \h </w:instrText>
+          <w:instrText xml:space="preserve"> PAGEREF _Toc242563662 \h </w:instrText>
         </w:r>
         <w:r>
           <w:rPr>
@@ -1085,7 +1085,7 @@
           <w14:ligatures w14:val="standardContextual"/>
         </w:rPr>
       </w:pPr>
-      <w:hyperlink w:anchor="_Toc242562275" w:history="1">
+      <w:hyperlink w:anchor="_Toc242563663" w:history="1">
         <w:r>
           <w:rPr>
             <w:rStyle w:val="aff8"/>
@@ -1127,7 +1127,7 @@
             <w:noProof/>
             <w:webHidden/>
           </w:rPr>
-          <w:instrText xml:space="preserve"> PAGEREF _Toc242562275 \h </w:instrText>
+          <w:instrText xml:space="preserve"> PAGEREF _Toc242563663 \h </w:instrText>
         </w:r>
         <w:r>
           <w:rPr>
@@ -1173,7 +1173,7 @@
           <w14:ligatures w14:val="standardContextual"/>
         </w:rPr>
       </w:pPr>
-      <w:hyperlink w:anchor="_Toc242562276" w:history="1">
+      <w:hyperlink w:anchor="_Toc242563664" w:history="1">
         <w:r>
           <w:rPr>
             <w:rStyle w:val="aff8"/>
@@ -1215,7 +1215,7 @@
             <w:noProof/>
             <w:webHidden/>
           </w:rPr>
-          <w:instrText xml:space="preserve"> PAGEREF _Toc242562276 \h </w:instrText>
+          <w:instrText xml:space="preserve"> PAGEREF _Toc242563664 \h </w:instrText>
         </w:r>
         <w:r>
           <w:rPr>
@@ -1261,7 +1261,7 @@
           <w14:ligatures w14:val="standardContextual"/>
         </w:rPr>
       </w:pPr>
-      <w:hyperlink w:anchor="_Toc242562277" w:history="1">
+      <w:hyperlink w:anchor="_Toc242563665" w:history="1">
         <w:r>
           <w:rPr>
             <w:rStyle w:val="aff8"/>
@@ -1303,7 +1303,7 @@
             <w:noProof/>
             <w:webHidden/>
           </w:rPr>
-          <w:instrText xml:space="preserve"> PAGEREF _Toc242562277 \h </w:instrText>
+          <w:instrText xml:space="preserve"> PAGEREF _Toc242563665 \h </w:instrText>
         </w:r>
         <w:r>
           <w:rPr>
@@ -1349,7 +1349,7 @@
           <w14:ligatures w14:val="standardContextual"/>
         </w:rPr>
       </w:pPr>
-      <w:hyperlink w:anchor="_Toc242562278" w:history="1">
+      <w:hyperlink w:anchor="_Toc242563666" w:history="1">
         <w:r>
           <w:rPr>
             <w:rStyle w:val="aff8"/>
@@ -1391,7 +1391,7 @@
             <w:noProof/>
             <w:webHidden/>
           </w:rPr>
-          <w:instrText xml:space="preserve"> PAGEREF _Toc242562278 \h </w:instrText>
+          <w:instrText xml:space="preserve"> PAGEREF _Toc242563666 \h </w:instrText>
         </w:r>
         <w:r>
           <w:rPr>
@@ -1437,7 +1437,7 @@
           <w14:ligatures w14:val="standardContextual"/>
         </w:rPr>
       </w:pPr>
-      <w:hyperlink w:anchor="_Toc242562279" w:history="1">
+      <w:hyperlink w:anchor="_Toc242563667" w:history="1">
         <w:r>
           <w:rPr>
             <w:rStyle w:val="aff8"/>
@@ -1479,7 +1479,7 @@
             <w:noProof/>
             <w:webHidden/>
           </w:rPr>
-          <w:instrText xml:space="preserve"> PAGEREF _Toc242562279 \h </w:instrText>
+          <w:instrText xml:space="preserve"> PAGEREF _Toc242563667 \h </w:instrText>
         </w:r>
         <w:r>
           <w:rPr>
@@ -1521,7 +1521,7 @@
         <w:pageBreakBefore/>
         <w:spacing w:before="0"/>
       </w:pPr>
-      <w:bookmarkStart w:id="0" w:name="_Toc242562266"/>
+      <w:bookmarkStart w:id="0" w:name="_Toc242563654"/>
       <w:r>
         <w:lastRenderedPageBreak/>
         <w:t>Введение</w:t>
@@ -1727,7 +1727,7 @@
         <w:ind w:left="709"/>
         <w:jc w:val="left"/>
       </w:pPr>
-      <w:bookmarkStart w:id="1" w:name="_Toc242562267"/>
+      <w:bookmarkStart w:id="1" w:name="_Toc242563655"/>
       <w:r>
         <w:lastRenderedPageBreak/>
         <w:t>1 Постановка задачи</w:t>
@@ -2001,7 +2001,7 @@
         <w:ind w:left="709"/>
         <w:jc w:val="left"/>
       </w:pPr>
-      <w:bookmarkStart w:id="2" w:name="_Toc242562268"/>
+      <w:bookmarkStart w:id="2" w:name="_Toc242563656"/>
       <w:r>
         <w:lastRenderedPageBreak/>
         <w:t>2 Теоретическая часть</w:t>
@@ -2277,7 +2277,7 @@
         <w:ind w:left="709"/>
         <w:jc w:val="left"/>
       </w:pPr>
-      <w:bookmarkStart w:id="3" w:name="_Toc242562269"/>
+      <w:bookmarkStart w:id="3" w:name="_Toc242563657"/>
       <w:r>
         <w:lastRenderedPageBreak/>
         <w:t>3 Ход работы</w:t>
@@ -2541,7 +2541,7 @@
           <w:noProof/>
         </w:rPr>
         <w:drawing>
-          <wp:inline distT="0" distB="0" distL="0" distR="0" wp14:anchorId="1134599D" wp14:editId="205E93B6">
+          <wp:inline distT="0" distB="0" distL="0" distR="0" wp14:anchorId="0111BD80" wp14:editId="209F862F">
             <wp:extent cx="3060000" cy="1835999"/>
             <wp:effectExtent l="0" t="0" r="0" b="0"/>
             <wp:docPr id="1" name="Picture 1"/>
@@ -2589,7 +2589,7 @@
         <w:spacing w:before="360" w:after="360"/>
       </w:pPr>
       <w:r>
-        <w:t>Рисунок 3.1 – Главная страница со списком диаграмм</w:t>
+        <w:t>Рисунок 3.1 – Главная страница</w:t>
       </w:r>
     </w:p>
     <w:p>
@@ -2667,7 +2667,12 @@
         <w:t>sequence</w:t>
       </w:r>
       <w:r>
-        <w:t xml:space="preserve">. Название каждой диаграммы является ссылкой на ее детальную страницу, а в нижней части страницы выводится подпись с названием практического занятия. Для отображения главной страницы маршрут вызывает метод контроллера, который получает массив диаграмм из хранилища и передает его в шаблон </w:t>
+        <w:t>. Название каждой диаграммы является ссылкой на ее детальную страницу, а в нижней части страницы выводится подпись с названием практического занятия.</w:t>
+      </w:r>
+    </w:p>
+    <w:p>
+      <w:r>
+        <w:t xml:space="preserve">Для отображения главной страницы маршрут вызывает метод контроллера, который получает массив диаграмм из хранилища и передает его в шаблон </w:t>
       </w:r>
       <w:r>
         <w:rPr>
@@ -2712,43 +2717,7 @@
         <w:t>authQuery</w:t>
       </w:r>
       <w:r>
-        <w:t xml:space="preserve">, поэтому авторизация сохраняется при переходах между страницами. При этом в журнале запросов появляется запись об обращении к главной странице со статусом 200, а в консоли сервера выводится строка с методом, адресом, кодом ответа и временем обработки. Начальные данные списка вынесены в папку </w:t>
-      </w:r>
-      <w:r>
-        <w:rPr>
-          <w:i/>
-        </w:rPr>
-        <w:t>seeds</w:t>
-      </w:r>
-      <w:r>
-        <w:t xml:space="preserve">/ и содержат два элемента, «Архитектуру микросервисов» с типом </w:t>
-      </w:r>
-      <w:r>
-        <w:rPr>
-          <w:i/>
-        </w:rPr>
-        <w:t>flowchart</w:t>
-      </w:r>
-      <w:r>
-        <w:t xml:space="preserve"> и «Поток авторизации </w:t>
-      </w:r>
-      <w:r>
-        <w:rPr>
-          <w:i/>
-        </w:rPr>
-        <w:t>JWT</w:t>
-      </w:r>
-      <w:r>
-        <w:t xml:space="preserve">» с типом </w:t>
-      </w:r>
-      <w:r>
-        <w:rPr>
-          <w:i/>
-        </w:rPr>
-        <w:t>sequence</w:t>
-      </w:r>
-      <w:r>
-        <w:t>.</w:t>
+        <w:t>, поэтому авторизация сохраняется при переходах между страницами. При этом в журнале запросов появляется запись об обращении к главной странице со статусом 200, а в консоли сервера выводится строка с методом, адресом, кодом ответа и временем обработки.</w:t>
       </w:r>
     </w:p>
     <w:p>
@@ -2783,7 +2752,7 @@
           <w:noProof/>
         </w:rPr>
         <w:drawing>
-          <wp:inline distT="0" distB="0" distL="0" distR="0" wp14:anchorId="67557605" wp14:editId="549D93E7">
+          <wp:inline distT="0" distB="0" distL="0" distR="0" wp14:anchorId="22EB72C6" wp14:editId="3D9ECFAA">
             <wp:extent cx="3060000" cy="1835999"/>
             <wp:effectExtent l="0" t="0" r="0" b="0"/>
             <wp:docPr id="2" name="Picture 2"/>
@@ -2831,7 +2800,7 @@
         <w:spacing w:before="360" w:after="360"/>
       </w:pPr>
       <w:r>
-        <w:t>Рисунок 3.2 – Детальная страница диаграммы</w:t>
+        <w:t>Рисунок 3.2 – Страница диаграммы</w:t>
       </w:r>
     </w:p>
     <w:p>
@@ -2935,7 +2904,7 @@
           <w:noProof/>
         </w:rPr>
         <w:drawing>
-          <wp:inline distT="0" distB="0" distL="0" distR="0" wp14:anchorId="3C3FE8F3" wp14:editId="7AD8788F">
+          <wp:inline distT="0" distB="0" distL="0" distR="0" wp14:anchorId="109171A8" wp14:editId="36C2015D">
             <wp:extent cx="3060000" cy="1835999"/>
             <wp:effectExtent l="0" t="0" r="0" b="0"/>
             <wp:docPr id="3" name="Picture 3"/>
@@ -2983,7 +2952,7 @@
         <w:spacing w:before="360" w:after="360"/>
       </w:pPr>
       <w:r>
-        <w:t>Рисунок 3.3 – Форма добавления диаграммы</w:t>
+        <w:t>Рисунок 3.3 – Форма добавления</w:t>
       </w:r>
     </w:p>
     <w:p>
@@ -3056,7 +3025,7 @@
           <w:noProof/>
         </w:rPr>
         <w:drawing>
-          <wp:inline distT="0" distB="0" distL="0" distR="0" wp14:anchorId="5D95EE53" wp14:editId="5BE4C10A">
+          <wp:inline distT="0" distB="0" distL="0" distR="0" wp14:anchorId="4BBB23A0" wp14:editId="65529EF8">
             <wp:extent cx="3060000" cy="1835999"/>
             <wp:effectExtent l="0" t="0" r="0" b="0"/>
             <wp:docPr id="4" name="Picture 4"/>
@@ -3181,7 +3150,7 @@
           <w:noProof/>
         </w:rPr>
         <w:drawing>
-          <wp:inline distT="0" distB="0" distL="0" distR="0" wp14:anchorId="71CE8322" wp14:editId="1A899BC7">
+          <wp:inline distT="0" distB="0" distL="0" distR="0" wp14:anchorId="2DA974E0" wp14:editId="58F5749D">
             <wp:extent cx="3060000" cy="1835999"/>
             <wp:effectExtent l="0" t="0" r="0" b="0"/>
             <wp:docPr id="5" name="Picture 5"/>
@@ -3229,7 +3198,7 @@
         <w:spacing w:before="360" w:after="360"/>
       </w:pPr>
       <w:r>
-        <w:t>Рисунок 3.5 – Список после добавления элемента</w:t>
+        <w:t>Рисунок 3.5 – Обновленный список</w:t>
       </w:r>
     </w:p>
     <w:p>
@@ -3284,7 +3253,7 @@
           <w:noProof/>
         </w:rPr>
         <w:drawing>
-          <wp:inline distT="0" distB="0" distL="0" distR="0" wp14:anchorId="2C29CE7A" wp14:editId="5AE2E61A">
+          <wp:inline distT="0" distB="0" distL="0" distR="0" wp14:anchorId="5B879090" wp14:editId="7AC1C2DE">
             <wp:extent cx="3060000" cy="1835999"/>
             <wp:effectExtent l="0" t="0" r="0" b="0"/>
             <wp:docPr id="6" name="Picture 6"/>
@@ -3332,7 +3301,7 @@
         <w:spacing w:before="360" w:after="360"/>
       </w:pPr>
       <w:r>
-        <w:t>Рисунок 3.6 – Сообщения валидации формы</w:t>
+        <w:t>Рисунок 3.6 – Ошибки в форме</w:t>
       </w:r>
     </w:p>
     <w:p>
@@ -3409,7 +3378,7 @@
           <w:noProof/>
         </w:rPr>
         <w:drawing>
-          <wp:inline distT="0" distB="0" distL="0" distR="0" wp14:anchorId="4DA24DBC" wp14:editId="668CFA6A">
+          <wp:inline distT="0" distB="0" distL="0" distR="0" wp14:anchorId="765DC7B0" wp14:editId="06C2B3AF">
             <wp:extent cx="3060000" cy="1835999"/>
             <wp:effectExtent l="0" t="0" r="0" b="0"/>
             <wp:docPr id="7" name="Picture 7"/>
@@ -3457,7 +3426,7 @@
         <w:spacing w:before="360" w:after="360"/>
       </w:pPr>
       <w:r>
-        <w:t>Рисунок 3.7 – Перенаправление гостя на страницу авторизации</w:t>
+        <w:t>Рисунок 3.7 – Доступ запрещен</w:t>
       </w:r>
     </w:p>
     <w:p>
@@ -3509,7 +3478,7 @@
           <w:noProof/>
         </w:rPr>
         <w:drawing>
-          <wp:inline distT="0" distB="0" distL="0" distR="0" wp14:anchorId="496F9B89" wp14:editId="59AEA73E">
+          <wp:inline distT="0" distB="0" distL="0" distR="0" wp14:anchorId="76740714" wp14:editId="5C40878B">
             <wp:extent cx="3060000" cy="1835999"/>
             <wp:effectExtent l="0" t="0" r="0" b="0"/>
             <wp:docPr id="8" name="Picture 8"/>
@@ -3616,7 +3585,7 @@
           <w:noProof/>
         </w:rPr>
         <w:drawing>
-          <wp:inline distT="0" distB="0" distL="0" distR="0" wp14:anchorId="1C52D283" wp14:editId="3062AF07">
+          <wp:inline distT="0" distB="0" distL="0" distR="0" wp14:anchorId="329CD44F" wp14:editId="4589BB5B">
             <wp:extent cx="3060000" cy="1835999"/>
             <wp:effectExtent l="0" t="0" r="0" b="0"/>
             <wp:docPr id="9" name="Picture 9"/>
@@ -3728,7 +3697,7 @@
           <w:noProof/>
         </w:rPr>
         <w:drawing>
-          <wp:inline distT="0" distB="0" distL="0" distR="0" wp14:anchorId="54E1654D" wp14:editId="65F818EE">
+          <wp:inline distT="0" distB="0" distL="0" distR="0" wp14:anchorId="4FE57809" wp14:editId="313AD347">
             <wp:extent cx="3060000" cy="1631999"/>
             <wp:effectExtent l="0" t="0" r="0" b="0"/>
             <wp:docPr id="10" name="Picture 10"/>
@@ -3776,19 +3745,7 @@
         <w:spacing w:before="360" w:after="360"/>
       </w:pPr>
       <w:r>
-        <w:t xml:space="preserve">Рисунок 3.10 – Журнал запросов в виде таблицы (страница </w:t>
-      </w:r>
-      <w:r>
-        <w:t>/</w:t>
-      </w:r>
-      <w:r>
-        <w:rPr>
-          <w:i/>
-        </w:rPr>
-        <w:t>logs</w:t>
-      </w:r>
-      <w:r>
-        <w:t>)</w:t>
+        <w:t>Рисунок 3.10 – Журнал запросов</w:t>
       </w:r>
     </w:p>
     <w:p>
@@ -3883,7 +3840,7 @@
           <w:noProof/>
         </w:rPr>
         <w:drawing>
-          <wp:inline distT="0" distB="0" distL="0" distR="0" wp14:anchorId="79E15A1E" wp14:editId="554B342C">
+          <wp:inline distT="0" distB="0" distL="0" distR="0" wp14:anchorId="38C814BF" wp14:editId="6ED0C7F0">
             <wp:extent cx="3060000" cy="1631999"/>
             <wp:effectExtent l="0" t="0" r="0" b="0"/>
             <wp:docPr id="11" name="Picture 11"/>
@@ -3931,7 +3888,7 @@
         <w:spacing w:before="360" w:after="360"/>
       </w:pPr>
       <w:r>
-        <w:t xml:space="preserve">Рисунок 3.11 – Журнал с фильтром по методу </w:t>
+        <w:t xml:space="preserve">Рисунок 3.11 – Фильтр по </w:t>
       </w:r>
       <w:r>
         <w:rPr>
@@ -3978,7 +3935,7 @@
           <w:noProof/>
         </w:rPr>
         <w:drawing>
-          <wp:inline distT="0" distB="0" distL="0" distR="0" wp14:anchorId="411D5ED1" wp14:editId="1ECB41CF">
+          <wp:inline distT="0" distB="0" distL="0" distR="0" wp14:anchorId="5A93393F" wp14:editId="5D0817DA">
             <wp:extent cx="4680000" cy="2469155"/>
             <wp:effectExtent l="0" t="0" r="0" b="0"/>
             <wp:docPr id="12" name="Picture 12"/>
@@ -4960,7 +4917,7 @@
         <w:ind w:left="709"/>
         <w:jc w:val="left"/>
       </w:pPr>
-      <w:bookmarkStart w:id="4" w:name="_Toc242562270"/>
+      <w:bookmarkStart w:id="4" w:name="_Toc242563658"/>
       <w:r>
         <w:lastRenderedPageBreak/>
         <w:t>4 Ответы на контрольные вопросы</w:t>
@@ -5322,7 +5279,7 @@
         <w:pageBreakBefore/>
         <w:spacing w:before="0"/>
       </w:pPr>
-      <w:bookmarkStart w:id="5" w:name="_Toc242562271"/>
+      <w:bookmarkStart w:id="5" w:name="_Toc242563659"/>
       <w:r>
         <w:lastRenderedPageBreak/>
         <w:t>Заключение</w:t>
@@ -5413,12 +5370,30 @@
     </w:p>
     <w:p>
       <w:r>
-        <w:t>Дополнительно реализованы проверка полей формы на стороне сервера, журнал запросов с фильтрацией по методу и типу события и начальные данные для тестов и демонстрации. Исходный код приложения вынесен в приложения А–И, а результаты работы показаны на рисунках 3.1–3.12.</w:t>
-      </w:r>
-    </w:p>
-    <w:p>
-      <w:r>
-        <w:t xml:space="preserve">Все пять задач практического занятия выполнены. Создано приложение с шаблонизатором </w:t>
+        <w:t>Дополнительно реализованы проверка полей формы на стороне сервера, журнал запросов с фильтрацией по методу и типу события и начальные данные для тестов и демонстрации. Исходный код приложения вынесен в приложения с А по И, а результаты работы показаны на рисунках с 3.1 по 3.12.</w:t>
+      </w:r>
+    </w:p>
+    <w:p>
+      <w:r>
+        <w:t xml:space="preserve">В ходе практического занятия изучены принципы работы </w:t>
+      </w:r>
+      <w:r>
+        <w:rPr>
+          <w:i/>
+        </w:rPr>
+        <w:t>middleware</w:t>
+      </w:r>
+      <w:r>
+        <w:t xml:space="preserve"> в </w:t>
+      </w:r>
+      <w:r>
+        <w:rPr>
+          <w:i/>
+        </w:rPr>
+        <w:t>Express.js</w:t>
+      </w:r>
+      <w:r>
+        <w:t xml:space="preserve"> и шаблонизатора </w:t>
       </w:r>
       <w:r>
         <w:rPr>
@@ -5427,7 +5402,7 @@
         <w:t>EJS</w:t>
       </w:r>
       <w:r>
-        <w:t xml:space="preserve"> и частичными шаблонами, реализованы </w:t>
+        <w:t xml:space="preserve">. Разработано приложение, в котором реализованы </w:t>
       </w:r>
       <w:r>
         <w:rPr>
@@ -5436,7 +5411,7 @@
         <w:t>middleware</w:t>
       </w:r>
       <w:r>
-        <w:t xml:space="preserve"> логирования и имитации авторизации, созданы динамические страницы списка, деталей и добавления, добавлены отдельные страницы ошибок 404 и 500. Работа показала, что </w:t>
+        <w:t xml:space="preserve"> логирования и имитации авторизации, динамические страницы списка, деталей и добавления и отдельные страницы ошибок 404 и 500. Показано, что порядок подключения </w:t>
       </w:r>
       <w:r>
         <w:rPr>
@@ -5445,7 +5420,7 @@
         <w:t>middleware</w:t>
       </w:r>
       <w:r>
-        <w:t xml:space="preserve"> удобны для выделения сквозной логики, а порядок их подключения напрямую влияет на результат.</w:t>
+        <w:t xml:space="preserve"> определяет поведение приложения.</w:t>
       </w:r>
     </w:p>
     <w:p>
@@ -5545,7 +5520,7 @@
         <w:pageBreakBefore/>
         <w:spacing w:before="0"/>
       </w:pPr>
-      <w:bookmarkStart w:id="6" w:name="_Toc242562272"/>
+      <w:bookmarkStart w:id="6" w:name="_Toc242563660"/>
       <w:r>
         <w:lastRenderedPageBreak/>
         <w:t>Приложение А</w:t>
@@ -6095,7 +6070,7 @@
         <w:pageBreakBefore/>
         <w:spacing w:before="0"/>
       </w:pPr>
-      <w:bookmarkStart w:id="7" w:name="_Toc242562273"/>
+      <w:bookmarkStart w:id="7" w:name="_Toc242563661"/>
       <w:r>
         <w:lastRenderedPageBreak/>
         <w:t>Приложение Б</w:t>
@@ -6521,7 +6496,7 @@
         <w:pageBreakBefore/>
         <w:spacing w:before="0"/>
       </w:pPr>
-      <w:bookmarkStart w:id="8" w:name="_Toc242562274"/>
+      <w:bookmarkStart w:id="8" w:name="_Toc242563662"/>
       <w:r>
         <w:lastRenderedPageBreak/>
         <w:t>Приложение В</w:t>
@@ -6906,7 +6881,7 @@
         <w:pageBreakBefore/>
         <w:spacing w:before="0"/>
       </w:pPr>
-      <w:bookmarkStart w:id="9" w:name="_Toc242562275"/>
+      <w:bookmarkStart w:id="9" w:name="_Toc242563663"/>
       <w:r>
         <w:lastRenderedPageBreak/>
         <w:t>Приложение Г</w:t>
@@ -7359,7 +7334,7 @@
         <w:pageBreakBefore/>
         <w:spacing w:before="0"/>
       </w:pPr>
-      <w:bookmarkStart w:id="10" w:name="_Toc242562276"/>
+      <w:bookmarkStart w:id="10" w:name="_Toc242563664"/>
       <w:r>
         <w:lastRenderedPageBreak/>
         <w:t>Приложение Д</w:t>
@@ -8047,7 +8022,7 @@
         <w:pageBreakBefore/>
         <w:spacing w:before="0"/>
       </w:pPr>
-      <w:bookmarkStart w:id="11" w:name="_Toc242562277"/>
+      <w:bookmarkStart w:id="11" w:name="_Toc242563665"/>
       <w:r>
         <w:lastRenderedPageBreak/>
         <w:t>Приложение Е</w:t>
@@ -8395,7 +8370,7 @@
         <w:pageBreakBefore/>
         <w:spacing w:before="0"/>
       </w:pPr>
-      <w:bookmarkStart w:id="12" w:name="_Toc242562278"/>
+      <w:bookmarkStart w:id="12" w:name="_Toc242563666"/>
       <w:r>
         <w:lastRenderedPageBreak/>
         <w:t>Приложение Ж</w:t>
@@ -8720,7 +8695,7 @@
         <w:pageBreakBefore/>
         <w:spacing w:before="0"/>
       </w:pPr>
-      <w:bookmarkStart w:id="13" w:name="_Toc242562279"/>
+      <w:bookmarkStart w:id="13" w:name="_Toc242563667"/>
       <w:r>
         <w:lastRenderedPageBreak/>
         <w:t>Приложение И</w:t>
@@ -9304,31 +9279,31 @@
       </w:rPr>
     </w:lvl>
   </w:abstractNum>
-  <w:num w:numId="1" w16cid:durableId="2112893712">
+  <w:num w:numId="1" w16cid:durableId="800537575">
     <w:abstractNumId w:val="8"/>
   </w:num>
-  <w:num w:numId="2" w16cid:durableId="780145086">
+  <w:num w:numId="2" w16cid:durableId="194972636">
     <w:abstractNumId w:val="6"/>
   </w:num>
-  <w:num w:numId="3" w16cid:durableId="1358308625">
+  <w:num w:numId="3" w16cid:durableId="1091202746">
     <w:abstractNumId w:val="5"/>
   </w:num>
-  <w:num w:numId="4" w16cid:durableId="507982913">
+  <w:num w:numId="4" w16cid:durableId="1842625487">
     <w:abstractNumId w:val="4"/>
   </w:num>
-  <w:num w:numId="5" w16cid:durableId="1187330495">
+  <w:num w:numId="5" w16cid:durableId="2070348227">
     <w:abstractNumId w:val="7"/>
   </w:num>
-  <w:num w:numId="6" w16cid:durableId="1100683608">
+  <w:num w:numId="6" w16cid:durableId="632517501">
     <w:abstractNumId w:val="3"/>
   </w:num>
-  <w:num w:numId="7" w16cid:durableId="1544756603">
+  <w:num w:numId="7" w16cid:durableId="2037655828">
     <w:abstractNumId w:val="2"/>
   </w:num>
-  <w:num w:numId="8" w16cid:durableId="1934166778">
+  <w:num w:numId="8" w16cid:durableId="97721450">
     <w:abstractNumId w:val="1"/>
   </w:num>
-  <w:num w:numId="9" w16cid:durableId="764111905">
+  <w:num w:numId="9" w16cid:durableId="328143936">
     <w:abstractNumId w:val="0"/>
   </w:num>
 </w:numbering>
@@ -20742,7 +20717,7 @@
     <w:basedOn w:val="a2"/>
     <w:uiPriority w:val="99"/>
     <w:unhideWhenUsed/>
-    <w:rsid w:val="00F7708A"/>
+    <w:rsid w:val="002F1A19"/>
     <w:rPr>
       <w:color w:val="0000FF" w:themeColor="hyperlink"/>
       <w:u w:val="single"/>

</xml_diff>

<commit_message>
docs: report for practical work 1 checked against STP 2024
</commit_message>
<xml_diff>
--- a/docs/Отчет_ПЗ1.docx
+++ b/docs/Отчет_ПЗ1.docx
@@ -368,7 +368,7 @@
       <w:r>
         <w:fldChar w:fldCharType="separate"/>
       </w:r>
-      <w:hyperlink w:anchor="_Toc242563654" w:history="1">
+      <w:hyperlink w:anchor="_Toc242565667" w:history="1">
         <w:r>
           <w:rPr>
             <w:rStyle w:val="aff8"/>
@@ -395,7 +395,7 @@
             <w:noProof/>
             <w:webHidden/>
           </w:rPr>
-          <w:instrText xml:space="preserve"> PAGEREF _Toc242563654 \h </w:instrText>
+          <w:instrText xml:space="preserve"> PAGEREF _Toc242565667 \h </w:instrText>
         </w:r>
         <w:r>
           <w:rPr>
@@ -441,7 +441,7 @@
           <w14:ligatures w14:val="standardContextual"/>
         </w:rPr>
       </w:pPr>
-      <w:hyperlink w:anchor="_Toc242563655" w:history="1">
+      <w:hyperlink w:anchor="_Toc242565668" w:history="1">
         <w:r>
           <w:rPr>
             <w:rStyle w:val="aff8"/>
@@ -468,7 +468,7 @@
             <w:noProof/>
             <w:webHidden/>
           </w:rPr>
-          <w:instrText xml:space="preserve"> PAGEREF _Toc242563655 \h </w:instrText>
+          <w:instrText xml:space="preserve"> PAGEREF _Toc242565668 \h </w:instrText>
         </w:r>
         <w:r>
           <w:rPr>
@@ -514,7 +514,7 @@
           <w14:ligatures w14:val="standardContextual"/>
         </w:rPr>
       </w:pPr>
-      <w:hyperlink w:anchor="_Toc242563656" w:history="1">
+      <w:hyperlink w:anchor="_Toc242565669" w:history="1">
         <w:r>
           <w:rPr>
             <w:rStyle w:val="aff8"/>
@@ -541,7 +541,7 @@
             <w:noProof/>
             <w:webHidden/>
           </w:rPr>
-          <w:instrText xml:space="preserve"> PAGEREF _Toc242563656 \h </w:instrText>
+          <w:instrText xml:space="preserve"> PAGEREF _Toc242565669 \h </w:instrText>
         </w:r>
         <w:r>
           <w:rPr>
@@ -587,7 +587,7 @@
           <w14:ligatures w14:val="standardContextual"/>
         </w:rPr>
       </w:pPr>
-      <w:hyperlink w:anchor="_Toc242563657" w:history="1">
+      <w:hyperlink w:anchor="_Toc242565670" w:history="1">
         <w:r>
           <w:rPr>
             <w:rStyle w:val="aff8"/>
@@ -614,7 +614,7 @@
             <w:noProof/>
             <w:webHidden/>
           </w:rPr>
-          <w:instrText xml:space="preserve"> PAGEREF _Toc242563657 \h </w:instrText>
+          <w:instrText xml:space="preserve"> PAGEREF _Toc242565670 \h </w:instrText>
         </w:r>
         <w:r>
           <w:rPr>
@@ -660,7 +660,7 @@
           <w14:ligatures w14:val="standardContextual"/>
         </w:rPr>
       </w:pPr>
-      <w:hyperlink w:anchor="_Toc242563658" w:history="1">
+      <w:hyperlink w:anchor="_Toc242565671" w:history="1">
         <w:r>
           <w:rPr>
             <w:rStyle w:val="aff8"/>
@@ -687,7 +687,7 @@
             <w:noProof/>
             <w:webHidden/>
           </w:rPr>
-          <w:instrText xml:space="preserve"> PAGEREF _Toc242563658 \h </w:instrText>
+          <w:instrText xml:space="preserve"> PAGEREF _Toc242565671 \h </w:instrText>
         </w:r>
         <w:r>
           <w:rPr>
@@ -733,7 +733,7 @@
           <w14:ligatures w14:val="standardContextual"/>
         </w:rPr>
       </w:pPr>
-      <w:hyperlink w:anchor="_Toc242563659" w:history="1">
+      <w:hyperlink w:anchor="_Toc242565672" w:history="1">
         <w:r>
           <w:rPr>
             <w:rStyle w:val="aff8"/>
@@ -760,7 +760,7 @@
             <w:noProof/>
             <w:webHidden/>
           </w:rPr>
-          <w:instrText xml:space="preserve"> PAGEREF _Toc242563659 \h </w:instrText>
+          <w:instrText xml:space="preserve"> PAGEREF _Toc242565672 \h </w:instrText>
         </w:r>
         <w:r>
           <w:rPr>
@@ -806,7 +806,7 @@
           <w14:ligatures w14:val="standardContextual"/>
         </w:rPr>
       </w:pPr>
-      <w:hyperlink w:anchor="_Toc242563660" w:history="1">
+      <w:hyperlink w:anchor="_Toc242565673" w:history="1">
         <w:r>
           <w:rPr>
             <w:rStyle w:val="aff8"/>
@@ -863,7 +863,7 @@
             <w:noProof/>
             <w:webHidden/>
           </w:rPr>
-          <w:instrText xml:space="preserve"> PAGEREF _Toc242563660 \h </w:instrText>
+          <w:instrText xml:space="preserve"> PAGEREF _Toc242565673 \h </w:instrText>
         </w:r>
         <w:r>
           <w:rPr>
@@ -909,7 +909,7 @@
           <w14:ligatures w14:val="standardContextual"/>
         </w:rPr>
       </w:pPr>
-      <w:hyperlink w:anchor="_Toc242563661" w:history="1">
+      <w:hyperlink w:anchor="_Toc242565674" w:history="1">
         <w:r>
           <w:rPr>
             <w:rStyle w:val="aff8"/>
@@ -951,7 +951,7 @@
             <w:noProof/>
             <w:webHidden/>
           </w:rPr>
-          <w:instrText xml:space="preserve"> PAGEREF _Toc242563661 \h </w:instrText>
+          <w:instrText xml:space="preserve"> PAGEREF _Toc242565674 \h </w:instrText>
         </w:r>
         <w:r>
           <w:rPr>
@@ -997,7 +997,7 @@
           <w14:ligatures w14:val="standardContextual"/>
         </w:rPr>
       </w:pPr>
-      <w:hyperlink w:anchor="_Toc242563662" w:history="1">
+      <w:hyperlink w:anchor="_Toc242565675" w:history="1">
         <w:r>
           <w:rPr>
             <w:rStyle w:val="aff8"/>
@@ -1039,7 +1039,7 @@
             <w:noProof/>
             <w:webHidden/>
           </w:rPr>
-          <w:instrText xml:space="preserve"> PAGEREF _Toc242563662 \h </w:instrText>
+          <w:instrText xml:space="preserve"> PAGEREF _Toc242565675 \h </w:instrText>
         </w:r>
         <w:r>
           <w:rPr>
@@ -1085,7 +1085,7 @@
           <w14:ligatures w14:val="standardContextual"/>
         </w:rPr>
       </w:pPr>
-      <w:hyperlink w:anchor="_Toc242563663" w:history="1">
+      <w:hyperlink w:anchor="_Toc242565676" w:history="1">
         <w:r>
           <w:rPr>
             <w:rStyle w:val="aff8"/>
@@ -1127,7 +1127,7 @@
             <w:noProof/>
             <w:webHidden/>
           </w:rPr>
-          <w:instrText xml:space="preserve"> PAGEREF _Toc242563663 \h </w:instrText>
+          <w:instrText xml:space="preserve"> PAGEREF _Toc242565676 \h </w:instrText>
         </w:r>
         <w:r>
           <w:rPr>
@@ -1173,7 +1173,7 @@
           <w14:ligatures w14:val="standardContextual"/>
         </w:rPr>
       </w:pPr>
-      <w:hyperlink w:anchor="_Toc242563664" w:history="1">
+      <w:hyperlink w:anchor="_Toc242565677" w:history="1">
         <w:r>
           <w:rPr>
             <w:rStyle w:val="aff8"/>
@@ -1215,7 +1215,7 @@
             <w:noProof/>
             <w:webHidden/>
           </w:rPr>
-          <w:instrText xml:space="preserve"> PAGEREF _Toc242563664 \h </w:instrText>
+          <w:instrText xml:space="preserve"> PAGEREF _Toc242565677 \h </w:instrText>
         </w:r>
         <w:r>
           <w:rPr>
@@ -1261,7 +1261,7 @@
           <w14:ligatures w14:val="standardContextual"/>
         </w:rPr>
       </w:pPr>
-      <w:hyperlink w:anchor="_Toc242563665" w:history="1">
+      <w:hyperlink w:anchor="_Toc242565678" w:history="1">
         <w:r>
           <w:rPr>
             <w:rStyle w:val="aff8"/>
@@ -1303,7 +1303,7 @@
             <w:noProof/>
             <w:webHidden/>
           </w:rPr>
-          <w:instrText xml:space="preserve"> PAGEREF _Toc242563665 \h </w:instrText>
+          <w:instrText xml:space="preserve"> PAGEREF _Toc242565678 \h </w:instrText>
         </w:r>
         <w:r>
           <w:rPr>
@@ -1349,7 +1349,7 @@
           <w14:ligatures w14:val="standardContextual"/>
         </w:rPr>
       </w:pPr>
-      <w:hyperlink w:anchor="_Toc242563666" w:history="1">
+      <w:hyperlink w:anchor="_Toc242565679" w:history="1">
         <w:r>
           <w:rPr>
             <w:rStyle w:val="aff8"/>
@@ -1391,7 +1391,7 @@
             <w:noProof/>
             <w:webHidden/>
           </w:rPr>
-          <w:instrText xml:space="preserve"> PAGEREF _Toc242563666 \h </w:instrText>
+          <w:instrText xml:space="preserve"> PAGEREF _Toc242565679 \h </w:instrText>
         </w:r>
         <w:r>
           <w:rPr>
@@ -1437,7 +1437,7 @@
           <w14:ligatures w14:val="standardContextual"/>
         </w:rPr>
       </w:pPr>
-      <w:hyperlink w:anchor="_Toc242563667" w:history="1">
+      <w:hyperlink w:anchor="_Toc242565680" w:history="1">
         <w:r>
           <w:rPr>
             <w:rStyle w:val="aff8"/>
@@ -1479,7 +1479,7 @@
             <w:noProof/>
             <w:webHidden/>
           </w:rPr>
-          <w:instrText xml:space="preserve"> PAGEREF _Toc242563667 \h </w:instrText>
+          <w:instrText xml:space="preserve"> PAGEREF _Toc242565680 \h </w:instrText>
         </w:r>
         <w:r>
           <w:rPr>
@@ -1521,7 +1521,7 @@
         <w:pageBreakBefore/>
         <w:spacing w:before="0"/>
       </w:pPr>
-      <w:bookmarkStart w:id="0" w:name="_Toc242563654"/>
+      <w:bookmarkStart w:id="0" w:name="_Toc242565667"/>
       <w:r>
         <w:lastRenderedPageBreak/>
         <w:t>Введение</w:t>
@@ -1727,7 +1727,7 @@
         <w:ind w:left="709"/>
         <w:jc w:val="left"/>
       </w:pPr>
-      <w:bookmarkStart w:id="1" w:name="_Toc242563655"/>
+      <w:bookmarkStart w:id="1" w:name="_Toc242565668"/>
       <w:r>
         <w:lastRenderedPageBreak/>
         <w:t>1 Постановка задачи</w:t>
@@ -2001,7 +2001,7 @@
         <w:ind w:left="709"/>
         <w:jc w:val="left"/>
       </w:pPr>
-      <w:bookmarkStart w:id="2" w:name="_Toc242563656"/>
+      <w:bookmarkStart w:id="2" w:name="_Toc242565669"/>
       <w:r>
         <w:lastRenderedPageBreak/>
         <w:t>2 Теоретическая часть</w:t>
@@ -2277,7 +2277,7 @@
         <w:ind w:left="709"/>
         <w:jc w:val="left"/>
       </w:pPr>
-      <w:bookmarkStart w:id="3" w:name="_Toc242563657"/>
+      <w:bookmarkStart w:id="3" w:name="_Toc242565670"/>
       <w:r>
         <w:lastRenderedPageBreak/>
         <w:t>3 Ход работы</w:t>
@@ -2541,7 +2541,7 @@
           <w:noProof/>
         </w:rPr>
         <w:drawing>
-          <wp:inline distT="0" distB="0" distL="0" distR="0" wp14:anchorId="0111BD80" wp14:editId="209F862F">
+          <wp:inline distT="0" distB="0" distL="0" distR="0" wp14:anchorId="7EA4BEEF" wp14:editId="113DC040">
             <wp:extent cx="3060000" cy="1835999"/>
             <wp:effectExtent l="0" t="0" r="0" b="0"/>
             <wp:docPr id="1" name="Picture 1"/>
@@ -2752,7 +2752,7 @@
           <w:noProof/>
         </w:rPr>
         <w:drawing>
-          <wp:inline distT="0" distB="0" distL="0" distR="0" wp14:anchorId="22EB72C6" wp14:editId="3D9ECFAA">
+          <wp:inline distT="0" distB="0" distL="0" distR="0" wp14:anchorId="0905209C" wp14:editId="24C0AD7B">
             <wp:extent cx="3060000" cy="1835999"/>
             <wp:effectExtent l="0" t="0" r="0" b="0"/>
             <wp:docPr id="2" name="Picture 2"/>
@@ -2904,7 +2904,7 @@
           <w:noProof/>
         </w:rPr>
         <w:drawing>
-          <wp:inline distT="0" distB="0" distL="0" distR="0" wp14:anchorId="109171A8" wp14:editId="36C2015D">
+          <wp:inline distT="0" distB="0" distL="0" distR="0" wp14:anchorId="0ECC12FD" wp14:editId="46013C71">
             <wp:extent cx="3060000" cy="1835999"/>
             <wp:effectExtent l="0" t="0" r="0" b="0"/>
             <wp:docPr id="3" name="Picture 3"/>
@@ -3025,7 +3025,7 @@
           <w:noProof/>
         </w:rPr>
         <w:drawing>
-          <wp:inline distT="0" distB="0" distL="0" distR="0" wp14:anchorId="4BBB23A0" wp14:editId="65529EF8">
+          <wp:inline distT="0" distB="0" distL="0" distR="0" wp14:anchorId="38788E4C" wp14:editId="03F7CBE2">
             <wp:extent cx="3060000" cy="1835999"/>
             <wp:effectExtent l="0" t="0" r="0" b="0"/>
             <wp:docPr id="4" name="Picture 4"/>
@@ -3150,7 +3150,7 @@
           <w:noProof/>
         </w:rPr>
         <w:drawing>
-          <wp:inline distT="0" distB="0" distL="0" distR="0" wp14:anchorId="2DA974E0" wp14:editId="58F5749D">
+          <wp:inline distT="0" distB="0" distL="0" distR="0" wp14:anchorId="54556183" wp14:editId="6A8AB235">
             <wp:extent cx="3060000" cy="1835999"/>
             <wp:effectExtent l="0" t="0" r="0" b="0"/>
             <wp:docPr id="5" name="Picture 5"/>
@@ -3253,7 +3253,7 @@
           <w:noProof/>
         </w:rPr>
         <w:drawing>
-          <wp:inline distT="0" distB="0" distL="0" distR="0" wp14:anchorId="5B879090" wp14:editId="7AC1C2DE">
+          <wp:inline distT="0" distB="0" distL="0" distR="0" wp14:anchorId="65E3905D" wp14:editId="66263C50">
             <wp:extent cx="3060000" cy="1835999"/>
             <wp:effectExtent l="0" t="0" r="0" b="0"/>
             <wp:docPr id="6" name="Picture 6"/>
@@ -3378,7 +3378,7 @@
           <w:noProof/>
         </w:rPr>
         <w:drawing>
-          <wp:inline distT="0" distB="0" distL="0" distR="0" wp14:anchorId="765DC7B0" wp14:editId="06C2B3AF">
+          <wp:inline distT="0" distB="0" distL="0" distR="0" wp14:anchorId="63E4C4EB" wp14:editId="5A634EE0">
             <wp:extent cx="3060000" cy="1835999"/>
             <wp:effectExtent l="0" t="0" r="0" b="0"/>
             <wp:docPr id="7" name="Picture 7"/>
@@ -3478,7 +3478,7 @@
           <w:noProof/>
         </w:rPr>
         <w:drawing>
-          <wp:inline distT="0" distB="0" distL="0" distR="0" wp14:anchorId="76740714" wp14:editId="5C40878B">
+          <wp:inline distT="0" distB="0" distL="0" distR="0" wp14:anchorId="2ED5C99B" wp14:editId="5AA41E2B">
             <wp:extent cx="3060000" cy="1835999"/>
             <wp:effectExtent l="0" t="0" r="0" b="0"/>
             <wp:docPr id="8" name="Picture 8"/>
@@ -3585,7 +3585,7 @@
           <w:noProof/>
         </w:rPr>
         <w:drawing>
-          <wp:inline distT="0" distB="0" distL="0" distR="0" wp14:anchorId="329CD44F" wp14:editId="4589BB5B">
+          <wp:inline distT="0" distB="0" distL="0" distR="0" wp14:anchorId="65262FCF" wp14:editId="05051063">
             <wp:extent cx="3060000" cy="1835999"/>
             <wp:effectExtent l="0" t="0" r="0" b="0"/>
             <wp:docPr id="9" name="Picture 9"/>
@@ -3697,7 +3697,7 @@
           <w:noProof/>
         </w:rPr>
         <w:drawing>
-          <wp:inline distT="0" distB="0" distL="0" distR="0" wp14:anchorId="4FE57809" wp14:editId="313AD347">
+          <wp:inline distT="0" distB="0" distL="0" distR="0" wp14:anchorId="2E5266EE" wp14:editId="2A437E72">
             <wp:extent cx="3060000" cy="1631999"/>
             <wp:effectExtent l="0" t="0" r="0" b="0"/>
             <wp:docPr id="10" name="Picture 10"/>
@@ -3840,7 +3840,7 @@
           <w:noProof/>
         </w:rPr>
         <w:drawing>
-          <wp:inline distT="0" distB="0" distL="0" distR="0" wp14:anchorId="38C814BF" wp14:editId="6ED0C7F0">
+          <wp:inline distT="0" distB="0" distL="0" distR="0" wp14:anchorId="7A56A7EA" wp14:editId="6974A74E">
             <wp:extent cx="3060000" cy="1631999"/>
             <wp:effectExtent l="0" t="0" r="0" b="0"/>
             <wp:docPr id="11" name="Picture 11"/>
@@ -3935,7 +3935,7 @@
           <w:noProof/>
         </w:rPr>
         <w:drawing>
-          <wp:inline distT="0" distB="0" distL="0" distR="0" wp14:anchorId="5A93393F" wp14:editId="5D0817DA">
+          <wp:inline distT="0" distB="0" distL="0" distR="0" wp14:anchorId="3B43395F" wp14:editId="1CFCC9C8">
             <wp:extent cx="4680000" cy="2469155"/>
             <wp:effectExtent l="0" t="0" r="0" b="0"/>
             <wp:docPr id="12" name="Picture 12"/>
@@ -4917,7 +4917,7 @@
         <w:ind w:left="709"/>
         <w:jc w:val="left"/>
       </w:pPr>
-      <w:bookmarkStart w:id="4" w:name="_Toc242563658"/>
+      <w:bookmarkStart w:id="4" w:name="_Toc242565671"/>
       <w:r>
         <w:lastRenderedPageBreak/>
         <w:t>4 Ответы на контрольные вопросы</w:t>
@@ -5279,7 +5279,7 @@
         <w:pageBreakBefore/>
         <w:spacing w:before="0"/>
       </w:pPr>
-      <w:bookmarkStart w:id="5" w:name="_Toc242563659"/>
+      <w:bookmarkStart w:id="5" w:name="_Toc242565672"/>
       <w:r>
         <w:lastRenderedPageBreak/>
         <w:t>Заключение</w:t>
@@ -5511,7 +5511,7 @@
         <w:t>views</w:t>
       </w:r>
       <w:r>
-        <w:t>, позволяет подключать приложение в тестах без запуска сервера и расширять его новыми страницами и обработчиками. Полученные навыки применимы при разработке серверной части курсового проекта, тематика которого совпадает с тематикой приложения.</w:t>
+        <w:t>, позволяет подключать приложение в тестах без запуска сервера и расширять его новыми страницами и обработчиками. Полученные навыки применимы при разработке серверной части курсового проекта, тематика которого совпадает с тематикой приложения. Для каждого сценария работы приложения получен скриншот страницы, поэтому результат можно проверить без запуска проекта.</w:t>
       </w:r>
     </w:p>
     <w:p>
@@ -5520,7 +5520,7 @@
         <w:pageBreakBefore/>
         <w:spacing w:before="0"/>
       </w:pPr>
-      <w:bookmarkStart w:id="6" w:name="_Toc242563660"/>
+      <w:bookmarkStart w:id="6" w:name="_Toc242565673"/>
       <w:r>
         <w:lastRenderedPageBreak/>
         <w:t>Приложение А</w:t>
@@ -5614,7 +5614,14 @@
           <w:rFonts w:cs="Courier New"/>
           <w:sz w:val="24"/>
         </w:rPr>
-        <w:t>const logger = require('./middlewares/logger');</w:t>
+        <w:t>const logger</w:t>
+      </w:r>
+      <w:r>
+        <w:rPr>
+          <w:rFonts w:cs="Courier New"/>
+          <w:sz w:val="24"/>
+        </w:rPr>
+        <w:t xml:space="preserve"> = require('./middlewares/logger');</w:t>
       </w:r>
     </w:p>
     <w:p>
@@ -5646,14 +5653,23 @@
           <w:rFonts w:cs="Courier New"/>
           <w:sz w:val="24"/>
         </w:rPr>
-        <w:t xml:space="preserve">const { notFoundHandler, </w:t>
-      </w:r>
+        <w:t>const { notFoundHandler, serverErrorHandler } = require('./middlewares/errorHandlers');</w:t>
+      </w:r>
+    </w:p>
+    <w:p>
+      <w:pPr>
+        <w:pStyle w:val="Listing"/>
+        <w:keepLines/>
+        <w:spacing w:line="240" w:lineRule="auto"/>
+        <w:ind w:left="709" w:firstLine="0"/>
+        <w:jc w:val="left"/>
+      </w:pPr>
       <w:r>
         <w:rPr>
           <w:rFonts w:cs="Courier New"/>
           <w:sz w:val="24"/>
         </w:rPr>
-        <w:t>serverErrorHandler } = require('./middlewares/errorHandlers');</w:t>
+        <w:t>const pageRoutes = require('./routes/pageRoutes');</w:t>
       </w:r>
     </w:p>
     <w:p>
@@ -5669,7 +5685,7 @@
           <w:rFonts w:cs="Courier New"/>
           <w:sz w:val="24"/>
         </w:rPr>
-        <w:t>const pageRoutes = require('./routes/pageRoutes');</w:t>
+        <w:t>const diagramRoutes = require('./routes/diagramRoutes');</w:t>
       </w:r>
     </w:p>
     <w:p>
@@ -5677,6 +5693,15 @@
         <w:pStyle w:val="Listing"/>
         <w:keepLines/>
         <w:spacing w:line="240" w:lineRule="auto"/>
+        <w:ind w:left="822" w:firstLine="0"/>
+        <w:jc w:val="left"/>
+      </w:pPr>
+    </w:p>
+    <w:p>
+      <w:pPr>
+        <w:pStyle w:val="Listing"/>
+        <w:keepLines/>
+        <w:spacing w:line="240" w:lineRule="auto"/>
         <w:ind w:left="709" w:firstLine="0"/>
         <w:jc w:val="left"/>
       </w:pPr>
@@ -5685,7 +5710,7 @@
           <w:rFonts w:cs="Courier New"/>
           <w:sz w:val="24"/>
         </w:rPr>
-        <w:t>const diagramRoutes = require('./routes/diagramRoutes');</w:t>
+        <w:t>const app = express();</w:t>
       </w:r>
     </w:p>
     <w:p>
@@ -5710,7 +5735,7 @@
           <w:rFonts w:cs="Courier New"/>
           <w:sz w:val="24"/>
         </w:rPr>
-        <w:t>const app = express();</w:t>
+        <w:t>// Шаблонизатор EJS.</w:t>
       </w:r>
     </w:p>
     <w:p>
@@ -5718,9 +5743,16 @@
         <w:pStyle w:val="Listing"/>
         <w:keepLines/>
         <w:spacing w:line="240" w:lineRule="auto"/>
-        <w:ind w:left="822" w:firstLine="0"/>
-        <w:jc w:val="left"/>
-      </w:pPr>
+        <w:ind w:left="709" w:firstLine="0"/>
+        <w:jc w:val="left"/>
+      </w:pPr>
+      <w:r>
+        <w:rPr>
+          <w:rFonts w:cs="Courier New"/>
+          <w:sz w:val="24"/>
+        </w:rPr>
+        <w:t>app.set('view engine', 'ejs');</w:t>
+      </w:r>
     </w:p>
     <w:p>
       <w:pPr>
@@ -5735,7 +5767,7 @@
           <w:rFonts w:cs="Courier New"/>
           <w:sz w:val="24"/>
         </w:rPr>
-        <w:t>// Шаблонизатор EJS.</w:t>
+        <w:t>app.set('views', path.join(__dirname, 'views'));</w:t>
       </w:r>
     </w:p>
     <w:p>
@@ -5743,6 +5775,15 @@
         <w:pStyle w:val="Listing"/>
         <w:keepLines/>
         <w:spacing w:line="240" w:lineRule="auto"/>
+        <w:ind w:left="822" w:firstLine="0"/>
+        <w:jc w:val="left"/>
+      </w:pPr>
+    </w:p>
+    <w:p>
+      <w:pPr>
+        <w:pStyle w:val="Listing"/>
+        <w:keepLines/>
+        <w:spacing w:line="240" w:lineRule="auto"/>
         <w:ind w:left="709" w:firstLine="0"/>
         <w:jc w:val="left"/>
       </w:pPr>
@@ -5751,7 +5792,7 @@
           <w:rFonts w:cs="Courier New"/>
           <w:sz w:val="24"/>
         </w:rPr>
-        <w:t>app.set('view engine', 'ejs');</w:t>
+        <w:t>// Helper для шаблонов: форматирование даты.</w:t>
       </w:r>
     </w:p>
     <w:p>
@@ -5767,7 +5808,14 @@
           <w:rFonts w:cs="Courier New"/>
           <w:sz w:val="24"/>
         </w:rPr>
-        <w:t>app.set('views', path.join(__dirname, 'views'));</w:t>
+        <w:t>app.locals.formatDate = (iso) =&gt; new Date(iso).</w:t>
+      </w:r>
+      <w:r>
+        <w:rPr>
+          <w:rFonts w:cs="Courier New"/>
+          <w:sz w:val="24"/>
+        </w:rPr>
+        <w:t>toLocaleString('ru-RU');</w:t>
       </w:r>
     </w:p>
     <w:p>
@@ -5792,7 +5840,7 @@
           <w:rFonts w:cs="Courier New"/>
           <w:sz w:val="24"/>
         </w:rPr>
-        <w:t>// Helper для шаблонов: форматирование даты.</w:t>
+        <w:t>// Статика подключается до маршрутов, чтобы файлы отдавались без лишних проверок.</w:t>
       </w:r>
     </w:p>
     <w:p>
@@ -5808,55 +5856,7 @@
           <w:rFonts w:cs="Courier New"/>
           <w:sz w:val="24"/>
         </w:rPr>
-        <w:t>app.locals.formatDate = (iso) =&gt; new Date(iso).toLocaleString('ru-RU');</w:t>
-      </w:r>
-    </w:p>
-    <w:p>
-      <w:pPr>
-        <w:pStyle w:val="Listing"/>
-        <w:keepLines/>
-        <w:spacing w:line="240" w:lineRule="auto"/>
-        <w:ind w:left="822" w:firstLine="0"/>
-        <w:jc w:val="left"/>
-      </w:pPr>
-    </w:p>
-    <w:p>
-      <w:pPr>
-        <w:pStyle w:val="Listing"/>
-        <w:keepLines/>
-        <w:spacing w:line="240" w:lineRule="auto"/>
-        <w:ind w:left="709" w:firstLine="0"/>
-        <w:jc w:val="left"/>
-      </w:pPr>
-      <w:r>
-        <w:rPr>
-          <w:rFonts w:cs="Courier New"/>
-          <w:sz w:val="24"/>
-        </w:rPr>
-        <w:t>// Статика подключается до маршрутов, чтобы файлы отдавались без лишних проверок.</w:t>
-      </w:r>
-    </w:p>
-    <w:p>
-      <w:pPr>
-        <w:pStyle w:val="Listing"/>
-        <w:keepLines/>
-        <w:spacing w:line="240" w:lineRule="auto"/>
-        <w:ind w:left="709" w:firstLine="0"/>
-        <w:jc w:val="left"/>
-      </w:pPr>
-      <w:r>
-        <w:rPr>
-          <w:rFonts w:cs="Courier New"/>
-          <w:sz w:val="24"/>
-        </w:rPr>
-        <w:t>app.use('/</w:t>
-      </w:r>
-      <w:r>
-        <w:rPr>
-          <w:rFonts w:cs="Courier New"/>
-          <w:sz w:val="24"/>
-        </w:rPr>
-        <w:t>static', express.static(path.join(__dirname, 'public')));</w:t>
+        <w:t>app.use('/static', express.static(path.join(__dirname, 'public')));</w:t>
       </w:r>
     </w:p>
     <w:p>
@@ -6070,7 +6070,7 @@
         <w:pageBreakBefore/>
         <w:spacing w:before="0"/>
       </w:pPr>
-      <w:bookmarkStart w:id="7" w:name="_Toc242563661"/>
+      <w:bookmarkStart w:id="7" w:name="_Toc242565674"/>
       <w:r>
         <w:lastRenderedPageBreak/>
         <w:t>Приложение Б</w:t>
@@ -6089,6 +6089,11 @@
           <w:caps w:val="0"/>
         </w:rPr>
         <w:br/>
+      </w:r>
+      <w:r>
+        <w:rPr>
+          <w:caps w:val="0"/>
+        </w:rPr>
         <w:t>Шаблон главной страницы (</w:t>
       </w:r>
       <w:r>
@@ -6151,14 +6156,32 @@
           <w:rFonts w:cs="Courier New"/>
           <w:sz w:val="24"/>
         </w:rPr>
-        <w:t>&lt;p&gt;&lt;a class="btn" href="/add</w:t>
-      </w:r>
+        <w:t>&lt;p&gt;&lt;a class="btn" href="/add&lt;%= authQuery %&gt;"&gt;Добавить диаграмму&lt;/a&gt;&lt;/p&gt;</w:t>
+      </w:r>
+    </w:p>
+    <w:p>
+      <w:pPr>
+        <w:pStyle w:val="Listing"/>
+        <w:keepLines/>
+        <w:spacing w:line="240" w:lineRule="auto"/>
+        <w:ind w:left="822" w:firstLine="0"/>
+        <w:jc w:val="left"/>
+      </w:pPr>
+    </w:p>
+    <w:p>
+      <w:pPr>
+        <w:pStyle w:val="Listing"/>
+        <w:keepLines/>
+        <w:spacing w:line="240" w:lineRule="auto"/>
+        <w:ind w:left="709" w:firstLine="0"/>
+        <w:jc w:val="left"/>
+      </w:pPr>
       <w:r>
         <w:rPr>
           <w:rFonts w:cs="Courier New"/>
           <w:sz w:val="24"/>
         </w:rPr>
-        <w:t>&lt;%= authQuery %&gt;"&gt;Добавить диаграмму&lt;/a&gt;&lt;/p&gt;</w:t>
+        <w:t>&lt;% if (items.length === 0) { %&gt;</w:t>
       </w:r>
     </w:p>
     <w:p>
@@ -6166,9 +6189,16 @@
         <w:pStyle w:val="Listing"/>
         <w:keepLines/>
         <w:spacing w:line="240" w:lineRule="auto"/>
-        <w:ind w:left="822" w:firstLine="0"/>
-        <w:jc w:val="left"/>
-      </w:pPr>
+        <w:ind w:left="1162" w:firstLine="0"/>
+        <w:jc w:val="left"/>
+      </w:pPr>
+      <w:r>
+        <w:rPr>
+          <w:rFonts w:cs="Courier New"/>
+          <w:sz w:val="24"/>
+        </w:rPr>
+        <w:t>&lt;p class="muted"&gt;Диаграмм пока нет.&lt;/p&gt;</w:t>
+      </w:r>
     </w:p>
     <w:p>
       <w:pPr>
@@ -6183,7 +6213,7 @@
           <w:rFonts w:cs="Courier New"/>
           <w:sz w:val="24"/>
         </w:rPr>
-        <w:t>&lt;% if (items.length === 0) { %&gt;</w:t>
+        <w:t>&lt;% } else { %&gt;</w:t>
       </w:r>
     </w:p>
     <w:p>
@@ -6199,7 +6229,7 @@
           <w:rFonts w:cs="Courier New"/>
           <w:sz w:val="24"/>
         </w:rPr>
-        <w:t>&lt;p class="muted"&gt;Диаграмм пока нет.&lt;/p&gt;</w:t>
+        <w:t>&lt;table&gt;</w:t>
       </w:r>
     </w:p>
     <w:p>
@@ -6207,7 +6237,7 @@
         <w:pStyle w:val="Listing"/>
         <w:keepLines/>
         <w:spacing w:line="240" w:lineRule="auto"/>
-        <w:ind w:left="709" w:firstLine="0"/>
+        <w:ind w:left="1616" w:firstLine="0"/>
         <w:jc w:val="left"/>
       </w:pPr>
       <w:r>
@@ -6215,7 +6245,7 @@
           <w:rFonts w:cs="Courier New"/>
           <w:sz w:val="24"/>
         </w:rPr>
-        <w:t>&lt;% } else { %&gt;</w:t>
+        <w:t>&lt;thead&gt;</w:t>
       </w:r>
     </w:p>
     <w:p>
@@ -6223,7 +6253,7 @@
         <w:pStyle w:val="Listing"/>
         <w:keepLines/>
         <w:spacing w:line="240" w:lineRule="auto"/>
-        <w:ind w:left="1162" w:firstLine="0"/>
+        <w:ind w:left="2069" w:firstLine="0"/>
         <w:jc w:val="left"/>
       </w:pPr>
       <w:r>
@@ -6231,7 +6261,7 @@
           <w:rFonts w:cs="Courier New"/>
           <w:sz w:val="24"/>
         </w:rPr>
-        <w:t>&lt;table&gt;</w:t>
+        <w:t>&lt;tr&gt;&lt;th&gt;ID&lt;/th&gt;&lt;th&gt;Название&lt;/th&gt;&lt;th&gt;Тип&lt;/th&gt;&lt;th&gt;Создана&lt;/th&gt;&lt;/tr&gt;</w:t>
       </w:r>
     </w:p>
     <w:p>
@@ -6247,7 +6277,7 @@
           <w:rFonts w:cs="Courier New"/>
           <w:sz w:val="24"/>
         </w:rPr>
-        <w:t>&lt;thead&gt;</w:t>
+        <w:t>&lt;/thead&gt;</w:t>
       </w:r>
     </w:p>
     <w:p>
@@ -6255,7 +6285,7 @@
         <w:pStyle w:val="Listing"/>
         <w:keepLines/>
         <w:spacing w:line="240" w:lineRule="auto"/>
-        <w:ind w:left="2069" w:firstLine="0"/>
+        <w:ind w:left="1616" w:firstLine="0"/>
         <w:jc w:val="left"/>
       </w:pPr>
       <w:r>
@@ -6263,7 +6293,7 @@
           <w:rFonts w:cs="Courier New"/>
           <w:sz w:val="24"/>
         </w:rPr>
-        <w:t>&lt;tr&gt;&lt;th&gt;ID&lt;/th&gt;&lt;th&gt;Название&lt;/th&gt;&lt;th&gt;Тип&lt;/th&gt;&lt;th&gt;Создана&lt;/th&gt;&lt;/tr&gt;</w:t>
+        <w:t>&lt;tbody&gt;</w:t>
       </w:r>
     </w:p>
     <w:p>
@@ -6271,7 +6301,7 @@
         <w:pStyle w:val="Listing"/>
         <w:keepLines/>
         <w:spacing w:line="240" w:lineRule="auto"/>
-        <w:ind w:left="1616" w:firstLine="0"/>
+        <w:ind w:left="2069" w:firstLine="0"/>
         <w:jc w:val="left"/>
       </w:pPr>
       <w:r>
@@ -6279,7 +6309,7 @@
           <w:rFonts w:cs="Courier New"/>
           <w:sz w:val="24"/>
         </w:rPr>
-        <w:t>&lt;/thead&gt;</w:t>
+        <w:t>&lt;% items.forEach(function (item) { %&gt;</w:t>
       </w:r>
     </w:p>
     <w:p>
@@ -6287,7 +6317,7 @@
         <w:pStyle w:val="Listing"/>
         <w:keepLines/>
         <w:spacing w:line="240" w:lineRule="auto"/>
-        <w:ind w:left="1616" w:firstLine="0"/>
+        <w:ind w:left="2523" w:firstLine="0"/>
         <w:jc w:val="left"/>
       </w:pPr>
       <w:r>
@@ -6295,7 +6325,7 @@
           <w:rFonts w:cs="Courier New"/>
           <w:sz w:val="24"/>
         </w:rPr>
-        <w:t>&lt;tbody&gt;</w:t>
+        <w:t>&lt;tr&gt;</w:t>
       </w:r>
     </w:p>
     <w:p>
@@ -6303,7 +6333,7 @@
         <w:pStyle w:val="Listing"/>
         <w:keepLines/>
         <w:spacing w:line="240" w:lineRule="auto"/>
-        <w:ind w:left="2069" w:firstLine="0"/>
+        <w:ind w:left="2976" w:firstLine="0"/>
         <w:jc w:val="left"/>
       </w:pPr>
       <w:r>
@@ -6311,7 +6341,7 @@
           <w:rFonts w:cs="Courier New"/>
           <w:sz w:val="24"/>
         </w:rPr>
-        <w:t>&lt;% items.forEach(function (item) { %&gt;</w:t>
+        <w:t>&lt;td&gt;&lt;%= item.id %&gt;&lt;/td&gt;</w:t>
       </w:r>
     </w:p>
     <w:p>
@@ -6319,7 +6349,7 @@
         <w:pStyle w:val="Listing"/>
         <w:keepLines/>
         <w:spacing w:line="240" w:lineRule="auto"/>
-        <w:ind w:left="2523" w:firstLine="0"/>
+        <w:ind w:left="2976" w:firstLine="0"/>
         <w:jc w:val="left"/>
       </w:pPr>
       <w:r>
@@ -6327,7 +6357,7 @@
           <w:rFonts w:cs="Courier New"/>
           <w:sz w:val="24"/>
         </w:rPr>
-        <w:t>&lt;tr&gt;</w:t>
+        <w:t>&lt;td&gt;&lt;a href="/item/&lt;%= item.id %&gt;&lt;%= authQuery %&gt;"&gt;&lt;%= item.title %&gt;&lt;/a&gt;&lt;/td&gt;</w:t>
       </w:r>
     </w:p>
     <w:p>
@@ -6343,39 +6373,14 @@
           <w:rFonts w:cs="Courier New"/>
           <w:sz w:val="24"/>
         </w:rPr>
-        <w:t>&lt;td&gt;&lt;%= item.id %&gt;&lt;/td&gt;</w:t>
-      </w:r>
-    </w:p>
-    <w:p>
-      <w:pPr>
-        <w:pStyle w:val="Listing"/>
-        <w:keepLines/>
-        <w:spacing w:line="240" w:lineRule="auto"/>
-        <w:ind w:left="2976" w:firstLine="0"/>
-        <w:jc w:val="left"/>
-      </w:pPr>
+        <w:t>&lt;td&gt;&lt;</w:t>
+      </w:r>
       <w:r>
         <w:rPr>
           <w:rFonts w:cs="Courier New"/>
           <w:sz w:val="24"/>
         </w:rPr>
-        <w:t>&lt;td&gt;&lt;a href="/item/&lt;%= item.id %&gt;&lt;%= authQuery %&gt;"&gt;&lt;%= item.title %&gt;&lt;/a&gt;&lt;/td&gt;</w:t>
-      </w:r>
-    </w:p>
-    <w:p>
-      <w:pPr>
-        <w:pStyle w:val="Listing"/>
-        <w:keepLines/>
-        <w:spacing w:line="240" w:lineRule="auto"/>
-        <w:ind w:left="2976" w:firstLine="0"/>
-        <w:jc w:val="left"/>
-      </w:pPr>
-      <w:r>
-        <w:rPr>
-          <w:rFonts w:cs="Courier New"/>
-          <w:sz w:val="24"/>
-        </w:rPr>
-        <w:t>&lt;td&gt;&lt;span class="badge"&gt;&lt;%= item.type %&gt;&lt;/span&gt;&lt;/td&gt;</w:t>
+        <w:t>span class="badge"&gt;&lt;%= item.type %&gt;&lt;/span&gt;&lt;/td&gt;</w:t>
       </w:r>
     </w:p>
     <w:p>
@@ -6496,7 +6501,7 @@
         <w:pageBreakBefore/>
         <w:spacing w:before="0"/>
       </w:pPr>
-      <w:bookmarkStart w:id="8" w:name="_Toc242563662"/>
+      <w:bookmarkStart w:id="8" w:name="_Toc242565675"/>
       <w:r>
         <w:lastRenderedPageBreak/>
         <w:t>Приложение В</w:t>
@@ -6705,7 +6710,14 @@
           <w:rFonts w:cs="Courier New"/>
           <w:sz w:val="24"/>
         </w:rPr>
-        <w:t>&lt;a class="brand" href="/&lt;%= authQuery %&gt;"&gt;VisualDSL&lt;/a&gt;</w:t>
+        <w:t xml:space="preserve">&lt;a class="brand" </w:t>
+      </w:r>
+      <w:r>
+        <w:rPr>
+          <w:rFonts w:cs="Courier New"/>
+          <w:sz w:val="24"/>
+        </w:rPr>
+        <w:t>href="/&lt;%= authQuery %&gt;"&gt;VisualDSL&lt;/a&gt;</w:t>
       </w:r>
     </w:p>
     <w:p>
@@ -6753,14 +6765,7 @@
           <w:rFonts w:cs="Courier New"/>
           <w:sz w:val="24"/>
         </w:rPr>
-        <w:t>&lt;a href="/add&lt;%= authQuery %&gt;"&gt;Добавить&lt;/</w:t>
-      </w:r>
-      <w:r>
-        <w:rPr>
-          <w:rFonts w:cs="Courier New"/>
-          <w:sz w:val="24"/>
-        </w:rPr>
-        <w:t>a&gt;</w:t>
+        <w:t>&lt;a href="/add&lt;%= authQuery %&gt;"&gt;Добавить&lt;/a&gt;</w:t>
       </w:r>
     </w:p>
     <w:p>
@@ -6881,7 +6886,7 @@
         <w:pageBreakBefore/>
         <w:spacing w:before="0"/>
       </w:pPr>
-      <w:bookmarkStart w:id="9" w:name="_Toc242563663"/>
+      <w:bookmarkStart w:id="9" w:name="_Toc242565676"/>
       <w:r>
         <w:lastRenderedPageBreak/>
         <w:t>Приложение Г</w:t>
@@ -6946,7 +6951,14 @@
           <w:rFonts w:cs="Courier New"/>
           <w:sz w:val="24"/>
         </w:rPr>
-        <w:t>// Запись попадает в журнал (таблица на странице /logs) и в консоль (кроме тестов).</w:t>
+        <w:t xml:space="preserve">// </w:t>
+      </w:r>
+      <w:r>
+        <w:rPr>
+          <w:rFonts w:cs="Courier New"/>
+          <w:sz w:val="24"/>
+        </w:rPr>
+        <w:t>Запись попадает в журнал (таблица на странице /logs) и в консоль (кроме тестов).</w:t>
       </w:r>
     </w:p>
     <w:p>
@@ -6987,14 +6999,7 @@
           <w:rFonts w:cs="Courier New"/>
           <w:sz w:val="24"/>
         </w:rPr>
-        <w:t>module.exports</w:t>
-      </w:r>
-      <w:r>
-        <w:rPr>
-          <w:rFonts w:cs="Courier New"/>
-          <w:sz w:val="24"/>
-        </w:rPr>
-        <w:t xml:space="preserve"> = (req, res, next) =&gt; {</w:t>
+        <w:t>module.exports = (req, res, next) =&gt; {</w:t>
       </w:r>
     </w:p>
     <w:p>
@@ -7334,7 +7339,7 @@
         <w:pageBreakBefore/>
         <w:spacing w:before="0"/>
       </w:pPr>
-      <w:bookmarkStart w:id="10" w:name="_Toc242563664"/>
+      <w:bookmarkStart w:id="10" w:name="_Toc242565677"/>
       <w:r>
         <w:lastRenderedPageBreak/>
         <w:t>Приложение Д</w:t>
@@ -7529,7 +7534,14 @@
           <w:rFonts w:cs="Courier New"/>
           <w:sz w:val="24"/>
         </w:rPr>
-        <w:t>if (status &gt;= 300) return 'Перенаправление';</w:t>
+        <w:t>if (</w:t>
+      </w:r>
+      <w:r>
+        <w:rPr>
+          <w:rFonts w:cs="Courier New"/>
+          <w:sz w:val="24"/>
+        </w:rPr>
+        <w:t>status &gt;= 300) return 'Перенаправление';</w:t>
       </w:r>
     </w:p>
     <w:p>
@@ -8022,7 +8034,7 @@
         <w:pageBreakBefore/>
         <w:spacing w:before="0"/>
       </w:pPr>
-      <w:bookmarkStart w:id="11" w:name="_Toc242563665"/>
+      <w:bookmarkStart w:id="11" w:name="_Toc242565678"/>
       <w:r>
         <w:lastRenderedPageBreak/>
         <w:t>Приложение Е</w:t>
@@ -8128,7 +8140,14 @@
           <w:rFonts w:cs="Courier New"/>
           <w:sz w:val="24"/>
         </w:rPr>
-        <w:t>// Определяет пользователя и передает его в шаблоны (res.locals).</w:t>
+        <w:t xml:space="preserve">// </w:t>
+      </w:r>
+      <w:r>
+        <w:rPr>
+          <w:rFonts w:cs="Courier New"/>
+          <w:sz w:val="24"/>
+        </w:rPr>
+        <w:t>Определяет пользователя и передает его в шаблоны (res.locals).</w:t>
       </w:r>
     </w:p>
     <w:p>
@@ -8192,14 +8211,7 @@
           <w:rFonts w:cs="Courier New"/>
           <w:sz w:val="24"/>
         </w:rPr>
-        <w:t xml:space="preserve">// </w:t>
-      </w:r>
-      <w:r>
-        <w:rPr>
-          <w:rFonts w:cs="Courier New"/>
-          <w:sz w:val="24"/>
-        </w:rPr>
-        <w:t>Суффикс для ссылок, чтобы "авторизация" сохранялась при переходах по сайту.</w:t>
+        <w:t>// Суффикс для ссылок, чтобы "авторизация" сохранялась при переходах по сайту.</w:t>
       </w:r>
     </w:p>
     <w:p>
@@ -8370,7 +8382,7 @@
         <w:pageBreakBefore/>
         <w:spacing w:before="0"/>
       </w:pPr>
-      <w:bookmarkStart w:id="12" w:name="_Toc242563666"/>
+      <w:bookmarkStart w:id="12" w:name="_Toc242565679"/>
       <w:r>
         <w:lastRenderedPageBreak/>
         <w:t>Приложение Ж</w:t>
@@ -8435,14 +8447,23 @@
           <w:rFonts w:cs="Courier New"/>
           <w:sz w:val="24"/>
         </w:rPr>
-        <w:t>const { requireAuth } = require('../middlewares/auth</w:t>
-      </w:r>
+        <w:t>const { requireAuth } = require('../middlewares/auth');</w:t>
+      </w:r>
+    </w:p>
+    <w:p>
+      <w:pPr>
+        <w:pStyle w:val="Listing"/>
+        <w:keepLines/>
+        <w:spacing w:line="240" w:lineRule="auto"/>
+        <w:ind w:left="709" w:firstLine="0"/>
+        <w:jc w:val="left"/>
+      </w:pPr>
       <w:r>
         <w:rPr>
           <w:rFonts w:cs="Courier New"/>
           <w:sz w:val="24"/>
         </w:rPr>
-        <w:t>');</w:t>
+        <w:t>const pages = require('../controllers/pageController');</w:t>
       </w:r>
     </w:p>
     <w:p>
@@ -8450,6 +8471,15 @@
         <w:pStyle w:val="Listing"/>
         <w:keepLines/>
         <w:spacing w:line="240" w:lineRule="auto"/>
+        <w:ind w:left="822" w:firstLine="0"/>
+        <w:jc w:val="left"/>
+      </w:pPr>
+    </w:p>
+    <w:p>
+      <w:pPr>
+        <w:pStyle w:val="Listing"/>
+        <w:keepLines/>
+        <w:spacing w:line="240" w:lineRule="auto"/>
         <w:ind w:left="709" w:firstLine="0"/>
         <w:jc w:val="left"/>
       </w:pPr>
@@ -8458,7 +8488,7 @@
           <w:rFonts w:cs="Courier New"/>
           <w:sz w:val="24"/>
         </w:rPr>
-        <w:t>const pages = require('../controllers/pageController');</w:t>
+        <w:t>const router = express.Router();</w:t>
       </w:r>
     </w:p>
     <w:p>
@@ -8483,7 +8513,7 @@
           <w:rFonts w:cs="Courier New"/>
           <w:sz w:val="24"/>
         </w:rPr>
-        <w:t>const router = express.Router();</w:t>
+        <w:t>router.get('/', pages.index);</w:t>
       </w:r>
     </w:p>
     <w:p>
@@ -8491,9 +8521,16 @@
         <w:pStyle w:val="Listing"/>
         <w:keepLines/>
         <w:spacing w:line="240" w:lineRule="auto"/>
-        <w:ind w:left="822" w:firstLine="0"/>
-        <w:jc w:val="left"/>
-      </w:pPr>
+        <w:ind w:left="709" w:firstLine="0"/>
+        <w:jc w:val="left"/>
+      </w:pPr>
+      <w:r>
+        <w:rPr>
+          <w:rFonts w:cs="Courier New"/>
+          <w:sz w:val="24"/>
+        </w:rPr>
+        <w:t>router.get('/item/:id', pages.item);</w:t>
+      </w:r>
     </w:p>
     <w:p>
       <w:pPr>
@@ -8508,7 +8545,7 @@
           <w:rFonts w:cs="Courier New"/>
           <w:sz w:val="24"/>
         </w:rPr>
-        <w:t>router.get('/', pages.index);</w:t>
+        <w:t>router.get('/login', pages.login);</w:t>
       </w:r>
     </w:p>
     <w:p>
@@ -8524,7 +8561,7 @@
           <w:rFonts w:cs="Courier New"/>
           <w:sz w:val="24"/>
         </w:rPr>
-        <w:t>router.get('/item/:id', pages.item);</w:t>
+        <w:t>router.get('/logs', pages.logs);</w:t>
       </w:r>
     </w:p>
     <w:p>
@@ -8540,7 +8577,7 @@
           <w:rFonts w:cs="Courier New"/>
           <w:sz w:val="24"/>
         </w:rPr>
-        <w:t>router.get('/login', pages.login);</w:t>
+        <w:t>// Middleware requireAuth выполняется только для этих маршрутов.</w:t>
       </w:r>
     </w:p>
     <w:p>
@@ -8556,39 +8593,14 @@
           <w:rFonts w:cs="Courier New"/>
           <w:sz w:val="24"/>
         </w:rPr>
-        <w:t>router.get('/logs', pages.logs);</w:t>
-      </w:r>
-    </w:p>
-    <w:p>
-      <w:pPr>
-        <w:pStyle w:val="Listing"/>
-        <w:keepLines/>
-        <w:spacing w:line="240" w:lineRule="auto"/>
-        <w:ind w:left="709" w:firstLine="0"/>
-        <w:jc w:val="left"/>
-      </w:pPr>
+        <w:t xml:space="preserve">router.get('/add', </w:t>
+      </w:r>
       <w:r>
         <w:rPr>
           <w:rFonts w:cs="Courier New"/>
           <w:sz w:val="24"/>
         </w:rPr>
-        <w:t>// Middleware requireAuth выполняется только для этих маршрутов.</w:t>
-      </w:r>
-    </w:p>
-    <w:p>
-      <w:pPr>
-        <w:pStyle w:val="Listing"/>
-        <w:keepLines/>
-        <w:spacing w:line="240" w:lineRule="auto"/>
-        <w:ind w:left="709" w:firstLine="0"/>
-        <w:jc w:val="left"/>
-      </w:pPr>
-      <w:r>
-        <w:rPr>
-          <w:rFonts w:cs="Courier New"/>
-          <w:sz w:val="24"/>
-        </w:rPr>
-        <w:t>router.get('/add', requireAuth, pages.addForm);</w:t>
+        <w:t>requireAuth, pages.addForm);</w:t>
       </w:r>
     </w:p>
     <w:p>
@@ -8695,7 +8707,7 @@
         <w:pageBreakBefore/>
         <w:spacing w:before="0"/>
       </w:pPr>
-      <w:bookmarkStart w:id="13" w:name="_Toc242563667"/>
+      <w:bookmarkStart w:id="13" w:name="_Toc242565680"/>
       <w:r>
         <w:lastRenderedPageBreak/>
         <w:t>Приложение И</w:t>
@@ -8801,7 +8813,14 @@
           <w:rFonts w:cs="Courier New"/>
           <w:sz w:val="24"/>
         </w:rPr>
-        <w:t>if (wantsJson(req)) return res.status(404).json({ error: 'Маршрут не найден' });</w:t>
+        <w:t>if (wantsJson(req)) return res.status(404).json({ error: '</w:t>
+      </w:r>
+      <w:r>
+        <w:rPr>
+          <w:rFonts w:cs="Courier New"/>
+          <w:sz w:val="24"/>
+        </w:rPr>
+        <w:t>Маршрут не найден' });</w:t>
       </w:r>
     </w:p>
     <w:p>
@@ -9279,31 +9298,31 @@
       </w:rPr>
     </w:lvl>
   </w:abstractNum>
-  <w:num w:numId="1" w16cid:durableId="800537575">
+  <w:num w:numId="1" w16cid:durableId="1858688424">
     <w:abstractNumId w:val="8"/>
   </w:num>
-  <w:num w:numId="2" w16cid:durableId="194972636">
+  <w:num w:numId="2" w16cid:durableId="1977371205">
     <w:abstractNumId w:val="6"/>
   </w:num>
-  <w:num w:numId="3" w16cid:durableId="1091202746">
+  <w:num w:numId="3" w16cid:durableId="1379016596">
     <w:abstractNumId w:val="5"/>
   </w:num>
-  <w:num w:numId="4" w16cid:durableId="1842625487">
+  <w:num w:numId="4" w16cid:durableId="1821573426">
     <w:abstractNumId w:val="4"/>
   </w:num>
-  <w:num w:numId="5" w16cid:durableId="2070348227">
+  <w:num w:numId="5" w16cid:durableId="1138763853">
     <w:abstractNumId w:val="7"/>
   </w:num>
-  <w:num w:numId="6" w16cid:durableId="632517501">
+  <w:num w:numId="6" w16cid:durableId="414059938">
     <w:abstractNumId w:val="3"/>
   </w:num>
-  <w:num w:numId="7" w16cid:durableId="2037655828">
+  <w:num w:numId="7" w16cid:durableId="1119569102">
     <w:abstractNumId w:val="2"/>
   </w:num>
-  <w:num w:numId="8" w16cid:durableId="97721450">
+  <w:num w:numId="8" w16cid:durableId="1181771604">
     <w:abstractNumId w:val="1"/>
   </w:num>
-  <w:num w:numId="9" w16cid:durableId="328143936">
+  <w:num w:numId="9" w16cid:durableId="1928151591">
     <w:abstractNumId w:val="0"/>
   </w:num>
 </w:numbering>
@@ -20717,7 +20736,7 @@
     <w:basedOn w:val="a2"/>
     <w:uiPriority w:val="99"/>
     <w:unhideWhenUsed/>
-    <w:rsid w:val="002F1A19"/>
+    <w:rsid w:val="005D7AC4"/>
     <w:rPr>
       <w:color w:val="0000FF" w:themeColor="hyperlink"/>
       <w:u w:val="single"/>

</xml_diff>